<commit_message>
26/05/2026 - 2.2 -> 3.4
</commit_message>
<xml_diff>
--- a/Alex Visoiu Licenta.docx
+++ b/Alex Visoiu Licenta.docx
@@ -313,8 +313,8 @@
         <w:rPr>
           <w:i/>
           <w:iCs/>
-          <w:sz w:val="36"/>
-          <w:szCs w:val="36"/>
+          <w:sz w:val="32"/>
+          <w:szCs w:val="32"/>
         </w:rPr>
       </w:pPr>
       <w:r>
@@ -325,52 +325,7 @@
           <w:sz w:val="36"/>
           <w:szCs w:val="36"/>
         </w:rPr>
-        <w:t>Titlu Prenume NUME</w:t>
-      </w:r>
-      <w:r>
-        <w:rPr>
-          <w:i/>
-          <w:iCs/>
-          <w:sz w:val="36"/>
-          <w:szCs w:val="36"/>
-        </w:rPr>
-        <w:tab/>
-      </w:r>
-      <w:r>
-        <w:rPr>
-          <w:i/>
-          <w:iCs/>
-          <w:sz w:val="36"/>
-          <w:szCs w:val="36"/>
-        </w:rPr>
-        <w:tab/>
-      </w:r>
-      <w:r>
-        <w:rPr>
-          <w:i/>
-          <w:iCs/>
-          <w:sz w:val="36"/>
-          <w:szCs w:val="36"/>
-        </w:rPr>
-        <w:tab/>
-      </w:r>
-      <w:r>
-        <w:rPr>
-          <w:i/>
-          <w:iCs/>
-          <w:sz w:val="36"/>
-          <w:szCs w:val="36"/>
-        </w:rPr>
-        <w:tab/>
-      </w:r>
-      <w:r>
-        <w:rPr>
-          <w:i/>
-          <w:iCs/>
-          <w:sz w:val="36"/>
-          <w:szCs w:val="36"/>
-        </w:rPr>
-        <w:tab/>
+        <w:t>Prof Dr. Ing.</w:t>
       </w:r>
       <w:r>
         <w:rPr>
@@ -380,49 +335,104 @@
           <w:sz w:val="36"/>
           <w:szCs w:val="36"/>
         </w:rPr>
-        <w:t>Prenume NUME</w:t>
-      </w:r>
-    </w:p>
-    <w:p>
-      <w:pPr>
-        <w:rPr>
-          <w:sz w:val="40"/>
-          <w:szCs w:val="40"/>
-        </w:rPr>
-      </w:pPr>
-    </w:p>
-    <w:p>
-      <w:pPr>
-        <w:rPr>
-          <w:sz w:val="40"/>
-          <w:szCs w:val="40"/>
-        </w:rPr>
-      </w:pPr>
-    </w:p>
-    <w:p>
-      <w:pPr>
-        <w:rPr>
-          <w:sz w:val="40"/>
-          <w:szCs w:val="40"/>
-        </w:rPr>
-      </w:pPr>
-    </w:p>
-    <w:p>
-      <w:pPr>
-        <w:jc w:val="center"/>
-        <w:rPr>
+        <w:t xml:space="preserve"> </w:t>
+      </w:r>
+      <w:r>
+        <w:rPr>
+          <w:i/>
+          <w:iCs/>
           <w:color w:val="EE0000"/>
           <w:sz w:val="36"/>
           <w:szCs w:val="36"/>
         </w:rPr>
-      </w:pPr>
-      <w:r>
+        <w:t>Corneliu Florea</w:t>
+      </w:r>
+      <w:r>
+        <w:rPr>
+          <w:i/>
+          <w:iCs/>
+          <w:sz w:val="36"/>
+          <w:szCs w:val="36"/>
+        </w:rPr>
+        <w:tab/>
+      </w:r>
+      <w:r>
+        <w:rPr>
+          <w:i/>
+          <w:iCs/>
+          <w:sz w:val="36"/>
+          <w:szCs w:val="36"/>
+        </w:rPr>
+        <w:tab/>
+      </w:r>
+      <w:r>
+        <w:rPr>
+          <w:i/>
+          <w:iCs/>
+          <w:sz w:val="36"/>
+          <w:szCs w:val="36"/>
+        </w:rPr>
+        <w:tab/>
+      </w:r>
+      <w:r>
+        <w:rPr>
+          <w:i/>
+          <w:iCs/>
+          <w:color w:val="EE0000"/>
+          <w:sz w:val="32"/>
+          <w:szCs w:val="32"/>
+        </w:rPr>
+        <w:t>Alex-Florin Visoiu</w:t>
+      </w:r>
+    </w:p>
+    <w:p>
+      <w:pPr>
+        <w:rPr>
+          <w:sz w:val="40"/>
+          <w:szCs w:val="40"/>
+        </w:rPr>
+      </w:pPr>
+    </w:p>
+    <w:p>
+      <w:pPr>
+        <w:rPr>
+          <w:sz w:val="40"/>
+          <w:szCs w:val="40"/>
+        </w:rPr>
+      </w:pPr>
+    </w:p>
+    <w:p>
+      <w:pPr>
+        <w:rPr>
+          <w:sz w:val="40"/>
+          <w:szCs w:val="40"/>
+        </w:rPr>
+      </w:pPr>
+    </w:p>
+    <w:p>
+      <w:pPr>
+        <w:jc w:val="center"/>
         <w:rPr>
           <w:color w:val="EE0000"/>
           <w:sz w:val="36"/>
           <w:szCs w:val="36"/>
         </w:rPr>
+      </w:pPr>
+      <w:r>
+        <w:rPr>
+          <w:color w:val="EE0000"/>
+          <w:sz w:val="36"/>
+          <w:szCs w:val="36"/>
+        </w:rPr>
         <w:t>Anul</w:t>
+      </w:r>
+      <w:r>
+        <w:rPr>
+          <w:color w:val="EE0000"/>
+          <w:sz w:val="36"/>
+          <w:szCs w:val="36"/>
+        </w:rPr>
+        <w:t xml:space="preserve"> 2026</w:t>
       </w:r>
     </w:p>
     <w:p>
@@ -445,7 +455,6 @@
     <w:p>
       <w:pPr>
         <w:sectPr>
-          <w:footerReference w:type="first" r:id="rId8"/>
           <w:pgSz w:w="11906" w:h="16838" w:code="9"/>
           <w:pgMar w:top="1440" w:right="1440" w:bottom="1440" w:left="1440" w:header="720" w:footer="720" w:gutter="0"/>
           <w:cols w:space="720"/>
@@ -1069,7 +1078,7 @@
           <w:color w:val="EE0000"/>
           <w:sz w:val="28"/>
         </w:rPr>
-        <w:t>Prenume NUME</w:t>
+        <w:t>Alex Visoiu</w:t>
       </w:r>
     </w:p>
     <w:p>
@@ -3040,6 +3049,105 @@
         <w:t>List of acronyms and abbreviations</w:t>
       </w:r>
     </w:p>
+    <w:p>
+      <w:pPr>
+        <w:pStyle w:val="ListParagraph"/>
+        <w:numPr>
+          <w:ilvl w:val="0"/>
+          <w:numId w:val="9"/>
+        </w:numPr>
+      </w:pPr>
+      <w:r>
+        <w:t>CNN -  Convolutional Neural Network – Rețea Neuronala Convoluționala</w:t>
+      </w:r>
+    </w:p>
+    <w:p>
+      <w:pPr>
+        <w:pStyle w:val="ListParagraph"/>
+        <w:numPr>
+          <w:ilvl w:val="0"/>
+          <w:numId w:val="9"/>
+        </w:numPr>
+      </w:pPr>
+      <w:r>
+        <w:t xml:space="preserve">BRATS - </w:t>
+      </w:r>
+      <w:r>
+        <w:t>Brain Tumor Segmentation</w:t>
+      </w:r>
+      <w:r>
+        <w:t xml:space="preserve"> -  Segmentarea tumorilor cerebrale</w:t>
+      </w:r>
+    </w:p>
+    <w:p>
+      <w:pPr>
+        <w:pStyle w:val="ListParagraph"/>
+        <w:numPr>
+          <w:ilvl w:val="0"/>
+          <w:numId w:val="9"/>
+        </w:numPr>
+      </w:pPr>
+      <w:r>
+        <w:t>LUNA16</w:t>
+      </w:r>
+      <w:r>
+        <w:t xml:space="preserve"> - </w:t>
+      </w:r>
+      <w:r>
+        <w:t>LUng Nodule Analysis 2016</w:t>
+      </w:r>
+      <w:r>
+        <w:t xml:space="preserve"> -  Analiza nodulilor pulmonari</w:t>
+      </w:r>
+    </w:p>
+    <w:p>
+      <w:pPr>
+        <w:pStyle w:val="ListParagraph"/>
+        <w:numPr>
+          <w:ilvl w:val="0"/>
+          <w:numId w:val="9"/>
+        </w:numPr>
+      </w:pPr>
+      <w:r>
+        <w:t>ISLES</w:t>
+      </w:r>
+      <w:r>
+        <w:t xml:space="preserve"> </w:t>
+      </w:r>
+      <w:r>
+        <w:t xml:space="preserve">- </w:t>
+      </w:r>
+      <w:r>
+        <w:t>Ischemic Stroke Lesion</w:t>
+      </w:r>
+      <w:r>
+        <w:rPr>
+          <w:b/>
+          <w:bCs/>
+        </w:rPr>
+        <w:t xml:space="preserve"> </w:t>
+      </w:r>
+      <w:r>
+        <w:t>Segmentation</w:t>
+      </w:r>
+      <w:r>
+        <w:rPr>
+          <w:b/>
+          <w:bCs/>
+        </w:rPr>
+        <w:t xml:space="preserve"> – </w:t>
+      </w:r>
+      <w:r>
+        <w:t>Segmentarea leziunilor din accidente vasculare cerebrale</w:t>
+      </w:r>
+      <w:r>
+        <w:rPr>
+          <w:b/>
+          <w:bCs/>
+        </w:rPr>
+        <w:t xml:space="preserve"> </w:t>
+      </w:r>
+    </w:p>
     <w:p/>
     <w:p>
       <w:r>
@@ -3183,15 +3291,12 @@
         <w:t>ferenta severa de scara între structurile segmentate. Ficatul fatului poate ocupa pana l</w:t>
       </w:r>
       <w:r>
-        <w:t xml:space="preserve">a 40% din secțiunea prezentată in imagine, iar artera ombilicala poate fi de zeci de ori mai mica decat ficatul sau stomacul. </w:t>
-      </w:r>
+        <w:t xml:space="preserve">a 40% din secțiunea prezentată in imagine, iar artera ombilicala poate fi de zeci de ori mai mica decat ficatul sau stomacul. (Fig.1). Aceste diferențe fac ca arhitectura clasică pentru segmentarea multi-label sa obțină metrici mici precum 0.2-0.3 chiar si dupa 60 de epoci de antrenare. </w:t>
+      </w:r>
+    </w:p>
+    <w:p>
       <w:r>
         <w:lastRenderedPageBreak/>
-        <w:t xml:space="preserve">(Fig.1). Aceste diferențe fac ca arhitectura clasică pentru segmentarea multi-label sa obțină metrici mici precum 0.2-0.3 chiar si dupa 60 de epoci de antrenare. </w:t>
-      </w:r>
-    </w:p>
-    <w:p>
-      <w:r>
         <w:tab/>
         <w:t>Automatizarea segementarii poate reduce eroarea umană, dar mai important, poate ușura înțelegerea imaginilor de către pacient. De asemenea, poate accelera fluxul de lucru în cabinetul medicului obstetrician, dar cel mai important, poate oferi specialistului un suport în cazurile extrem de dificile, care ar necesita o a doua sau a treia părere de la alți medici.</w:t>
       </w:r>
@@ -3223,9 +3328,6 @@
               <w:jc w:val="center"/>
             </w:pPr>
             <w:r>
-              <w:rPr>
-                <w:noProof/>
-              </w:rPr>
               <w:drawing>
                 <wp:inline distT="0" distB="0" distL="0" distR="0" wp14:anchorId="228588BF" wp14:editId="77DBCEF1">
                   <wp:extent cx="2798859" cy="2100540"/>
@@ -3242,7 +3344,7 @@
                           <pic:cNvPicPr/>
                         </pic:nvPicPr>
                         <pic:blipFill>
-                          <a:blip r:embed="rId9"/>
+                          <a:blip r:embed="rId8"/>
                           <a:stretch>
                             <a:fillRect/>
                           </a:stretch>
@@ -3290,10 +3392,7 @@
               <w:fldChar w:fldCharType="end"/>
             </w:r>
             <w:r>
-              <w:t xml:space="preserve"> </w:t>
-            </w:r>
-            <w:r>
-              <w:t>Ecografie abdominală cu organele evidențiate</w:t>
+              <w:t xml:space="preserve"> Ecografie abdominală cu organele evidențiate</w:t>
             </w:r>
           </w:p>
         </w:tc>
@@ -3389,19 +3488,10 @@
         </w:numPr>
       </w:pPr>
       <w:r>
-        <w:t xml:space="preserve">Evaluarea progresului </w:t>
-      </w:r>
-      <w:r>
-        <w:t>si evoluția modelului</w:t>
-      </w:r>
-      <w:r>
-        <w:t>, fiecare etapa introducând o modificare dar și o schimbare în rezultate</w:t>
-      </w:r>
-      <w:r>
-        <w:rPr>
-          <w:lang w:val="it-IT"/>
-        </w:rPr>
-        <w:t>:</w:t>
+        <w:t>Evaluarea progresului si evoluția modelului</w:t>
+      </w:r>
+      <w:r>
+        <w:t>, fiecare etapa introducând o modificare dar și o schimbare în rezultate:</w:t>
       </w:r>
     </w:p>
     <w:p>
@@ -3487,6 +3577,7 @@
         <w:pStyle w:val="Heading2"/>
       </w:pPr>
       <w:r>
+        <w:lastRenderedPageBreak/>
         <w:t xml:space="preserve"> Structura lucrării</w:t>
       </w:r>
     </w:p>
@@ -3587,13 +3678,7 @@
         <w:ind w:firstLine="576"/>
       </w:pPr>
       <w:r>
-        <w:t xml:space="preserve"> Această ecografie poate fi realizată 2D (Fig. 2), oferind cele mai multe informații despre anatomia fetala, 3D și 4D (Fig. 3), cele din urma oferind imagini mult mai clare, dar neconcludente din punct de vede medical.</w:t>
-      </w:r>
-      <w:r>
-        <w:t xml:space="preserve"> </w:t>
-      </w:r>
-      <w:r>
-        <w:t>[1]</w:t>
+        <w:t xml:space="preserve"> Această ecografie poate fi realizată 2D (Fig. 2), oferind cele mai multe informații despre anatomia fetala, 3D și 4D (Fig. 3), cele din urma oferind imagini mult mai clare, dar neconcludente din punct de vede medical. [1]</w:t>
       </w:r>
     </w:p>
     <w:p>
@@ -3608,9 +3693,6 @@
         <w:jc w:val="center"/>
       </w:pPr>
       <w:r>
-        <w:rPr>
-          <w:noProof/>
-        </w:rPr>
         <w:drawing>
           <wp:inline distT="0" distB="0" distL="0" distR="0" wp14:anchorId="69522722" wp14:editId="59440C61">
             <wp:extent cx="2387600" cy="1789376"/>
@@ -3629,7 +3711,7 @@
                     </pic:cNvPicPr>
                   </pic:nvPicPr>
                   <pic:blipFill>
-                    <a:blip r:embed="rId10" cstate="print">
+                    <a:blip r:embed="rId9" cstate="print">
                       <a:extLst>
                         <a:ext uri="{28A0092B-C50C-407E-A947-70E740481C1C}">
                           <a14:useLocalDpi xmlns:a14="http://schemas.microsoft.com/office/drawing/2010/main" val="0"/>
@@ -3665,39 +3747,30 @@
       <w:pPr>
         <w:pStyle w:val="Caption"/>
         <w:jc w:val="center"/>
+      </w:pPr>
+      <w:r>
+        <w:t xml:space="preserve">Figură </w:t>
+      </w:r>
+      <w:r>
+        <w:fldChar w:fldCharType="begin"/>
+      </w:r>
+      <w:r>
+        <w:instrText xml:space="preserve"> SEQ Figură \* ARABIC </w:instrText>
+      </w:r>
+      <w:r>
+        <w:fldChar w:fldCharType="separate"/>
+      </w:r>
+      <w:r>
         <w:rPr>
           <w:noProof/>
         </w:rPr>
-      </w:pPr>
-      <w:r>
-        <w:t xml:space="preserve">Figură </w:t>
-      </w:r>
-      <w:r>
-        <w:fldChar w:fldCharType="begin"/>
-      </w:r>
-      <w:r>
-        <w:instrText xml:space="preserve"> SEQ Figură \* ARABIC </w:instrText>
-      </w:r>
-      <w:r>
-        <w:fldChar w:fldCharType="separate"/>
-      </w:r>
-      <w:r>
-        <w:rPr>
-          <w:noProof/>
-        </w:rPr>
         <w:t>2</w:t>
       </w:r>
       <w:r>
         <w:fldChar w:fldCharType="end"/>
       </w:r>
       <w:r>
-        <w:t xml:space="preserve"> Ecografie </w:t>
-      </w:r>
-      <w:r>
-        <w:rPr>
-          <w:noProof/>
-        </w:rPr>
-        <w:t xml:space="preserve"> 2D - din baza de date</w:t>
+        <w:t xml:space="preserve"> Ecografie  2D - din baza de date</w:t>
       </w:r>
     </w:p>
     <w:p/>
@@ -3707,11 +3780,8 @@
         <w:jc w:val="center"/>
       </w:pPr>
       <w:r>
-        <w:rPr>
-          <w:noProof/>
-        </w:rPr>
         <w:drawing>
-          <wp:inline distT="0" distB="0" distL="0" distR="0" wp14:anchorId="54C3C462" wp14:editId="7E324515">
+          <wp:inline distT="0" distB="0" distL="0" distR="0" wp14:anchorId="54C3C462" wp14:editId="4756BC6D">
             <wp:extent cx="1937993" cy="2038350"/>
             <wp:effectExtent l="0" t="0" r="5715" b="0"/>
             <wp:docPr id="401081642" name="Picture 6"/>
@@ -3728,7 +3798,7 @@
                     </pic:cNvPicPr>
                   </pic:nvPicPr>
                   <pic:blipFill>
-                    <a:blip r:embed="rId11" cstate="print">
+                    <a:blip r:embed="rId10" cstate="print">
                       <a:extLst>
                         <a:ext uri="{28A0092B-C50C-407E-A947-70E740481C1C}">
                           <a14:useLocalDpi xmlns:a14="http://schemas.microsoft.com/office/drawing/2010/main" val="0"/>
@@ -3787,13 +3857,7 @@
         <w:fldChar w:fldCharType="end"/>
       </w:r>
       <w:r>
-        <w:t xml:space="preserve"> Ecografie </w:t>
-      </w:r>
-      <w:r>
-        <w:rPr>
-          <w:noProof/>
-        </w:rPr>
-        <w:t>3D/4D [2]</w:t>
+        <w:t xml:space="preserve"> Ecografie 3D/4D [2]</w:t>
       </w:r>
     </w:p>
     <w:p>
@@ -3828,16 +3892,7 @@
         <w:ind w:firstLine="720"/>
       </w:pPr>
       <w:r>
-        <w:t xml:space="preserve">Vena ombilicală reprezinta o parte importantă a sistemului circulator fetal. Spre deosebire de venele obișnuite ale corpului adult, vena ombilicală transportă sânge oxigenat de la placentă spre fătul in creștere. În timpul dezvoltării fătului, vena ombilicală pornește de la placentă, trece prin cordonul ombilical alături de artera ombilicală, ajungând la făt, pentru a-l alimenta cu oxigen de la mamă. La ecografia morfologică, identificarea evetualelor anomalii ale acesteia este esențială pentru monitorizarea dezvoltării sanatoase a fătului și în prevenirea complicațiilor prenatale și postnatale. </w:t>
-      </w:r>
-      <w:r>
-        <w:t>[</w:t>
-      </w:r>
-      <w:r>
-        <w:t>3</w:t>
-      </w:r>
-      <w:r>
-        <w:t>]</w:t>
+        <w:t>Vena ombilicală reprezinta o parte importantă a sistemului circulator fetal. Spre deosebire de venele obișnuite ale corpului adult, vena ombilicală transportă sânge oxigenat de la placentă spre fătul in creștere. În timpul dezvoltării fătului, vena ombilicală pornește de la placentă, trece prin cordonul ombilical alături de artera ombilicală, ajungând la făt, pentru a-l alimenta cu oxigen de la mamă. La ecografia morfologică, identificarea evetualelor anomalii ale acesteia este esențială pentru monitorizarea dezvoltării sanatoase a fătului și în prevenirea complicațiilor prenatale și postnatale. [3]</w:t>
       </w:r>
     </w:p>
     <w:p>
@@ -3855,10 +3910,7 @@
         </w:numPr>
       </w:pPr>
       <w:r>
-        <w:t>Artera</w:t>
-      </w:r>
-      <w:r>
-        <w:t xml:space="preserve"> ombilicală</w:t>
+        <w:t>Artera ombilicală</w:t>
       </w:r>
     </w:p>
     <w:p>
@@ -3914,19 +3966,7 @@
         <w:t xml:space="preserve"> homeostaza</w:t>
       </w:r>
       <w:r>
-        <w:t xml:space="preserve">. Ocupă o un volum semnificativ din cavitatea abdominală a fătului, fiind esențial dezvoltarii acestuia. Aceste caracteristici structurale și funcționale fac din ficatul fetal, un organ de referință în ecografia obstetricală, dar și o țintă relevantă pentru segmentarea automată. </w:t>
-      </w:r>
-      <w:r>
-        <w:t>[</w:t>
-      </w:r>
-      <w:r>
-        <w:t>5</w:t>
-      </w:r>
-      <w:r>
-        <w:t>]</w:t>
-      </w:r>
-      <w:r>
-        <w:t xml:space="preserve"> </w:t>
+        <w:t xml:space="preserve">. Ocupă o un volum semnificativ din cavitatea abdominală a fătului, fiind esențial dezvoltarii acestuia. Aceste caracteristici structurale și funcționale fac din ficatul fetal, un organ de referință în ecografia obstetricală, dar și o țintă relevantă pentru segmentarea automată. [5] </w:t>
       </w:r>
     </w:p>
     <w:p>
@@ -3943,10 +3983,7 @@
         </w:numPr>
       </w:pPr>
       <w:r>
-        <w:t>Stomacul</w:t>
-      </w:r>
-      <w:r>
-        <w:t xml:space="preserve"> fetal</w:t>
+        <w:t>Stomacul fetal</w:t>
       </w:r>
     </w:p>
     <w:p>
@@ -3959,6 +3996,1183 @@
       <w:r>
         <w:t>[5]</w:t>
       </w:r>
+    </w:p>
+    <w:p>
+      <w:pPr>
+        <w:pStyle w:val="Heading2"/>
+        <w:numPr>
+          <w:ilvl w:val="1"/>
+          <w:numId w:val="4"/>
+        </w:numPr>
+      </w:pPr>
+      <w:r>
+        <w:lastRenderedPageBreak/>
+        <w:t xml:space="preserve"> </w:t>
+      </w:r>
+      <w:r>
+        <w:t>Provocări specifice imaginilor ecografice</w:t>
+      </w:r>
+    </w:p>
+    <w:p>
+      <w:pPr>
+        <w:ind w:firstLine="432"/>
+      </w:pPr>
+      <w:r>
+        <w:t>Imaginile ecografice prezintă o serie de caracteristici care le diferențiază fundamental de alte modalități imagistice medicale, precum CT sau RMN, și care îngreunează considerabil procesul de segmentare automată.</w:t>
+      </w:r>
+    </w:p>
+    <w:p>
+      <w:pPr>
+        <w:ind w:firstLine="720"/>
+        <w:jc w:val="left"/>
+      </w:pPr>
+      <w:r>
+        <w:t>Cea mai importantă provocare este zgomotul de tip speckle, specific oricărei imagistici coerente, inclusiv ultrasunetelor. Acesta apare din cauza sumării</w:t>
+      </w:r>
+      <w:r>
+        <w:t xml:space="preserve"> </w:t>
+      </w:r>
+      <w:r>
+        <w:t xml:space="preserve">ecourilor reflectate de </w:t>
+      </w:r>
+      <w:r>
+        <w:t xml:space="preserve">țesuturi </w:t>
+      </w:r>
+      <w:r>
+        <w:t>la scară microscopică. Textura granulară rezultată nu corespunde structurii anatomice reale a țesutului, ci este un artefact al procesului de achiziție. Distribuția statistică a amplitudinii semnalului urmează o distribuție Rayleigh în condiții de speckle complet dezvoltat, ceea ce face ca metodele clasice de procesare a imaginilor să nu fie direct aplicabile.</w:t>
+      </w:r>
+      <w:r>
+        <w:t xml:space="preserve"> </w:t>
+      </w:r>
+      <w:r>
+        <w:t>[</w:t>
+      </w:r>
+      <w:r>
+        <w:t>6</w:t>
+      </w:r>
+      <w:r>
+        <w:t>]</w:t>
+      </w:r>
+    </w:p>
+    <w:p>
+      <w:pPr>
+        <w:ind w:firstLine="720"/>
+      </w:pPr>
+      <w:r>
+        <w:t>Un alt impediement îl</w:t>
+      </w:r>
+      <w:r>
+        <w:t xml:space="preserve"> reprezintă contrastul scăzut dintre structurile de interes și țesuturile adiacente. Spre deosebire de CT, unde diferențele de densitate produc contraste clare, în ecografie regiunile anatomice învecinate pot avea valori de intensitate similare, făcând delimitarea contururilor dificilă.</w:t>
+      </w:r>
+      <w:r>
+        <w:t xml:space="preserve"> </w:t>
+      </w:r>
+      <w:r>
+        <w:t>[6]</w:t>
+      </w:r>
+    </w:p>
+    <w:p>
+      <w:pPr>
+        <w:keepNext/>
+        <w:ind w:left="1440" w:firstLine="720"/>
+      </w:pPr>
+      <w:r>
+        <w:t xml:space="preserve">        </w:t>
+      </w:r>
+      <w:r>
+        <w:drawing>
+          <wp:inline distT="0" distB="0" distL="0" distR="0" wp14:anchorId="76431DEA" wp14:editId="39C8F77D">
+            <wp:extent cx="2234316" cy="1722641"/>
+            <wp:effectExtent l="0" t="0" r="0" b="0"/>
+            <wp:docPr id="1592681239" name="Picture 1"/>
+            <wp:cNvGraphicFramePr>
+              <a:graphicFrameLocks xmlns:a="http://schemas.openxmlformats.org/drawingml/2006/main" noChangeAspect="1"/>
+            </wp:cNvGraphicFramePr>
+            <a:graphic xmlns:a="http://schemas.openxmlformats.org/drawingml/2006/main">
+              <a:graphicData uri="http://schemas.openxmlformats.org/drawingml/2006/picture">
+                <pic:pic xmlns:pic="http://schemas.openxmlformats.org/drawingml/2006/picture">
+                  <pic:nvPicPr>
+                    <pic:cNvPr id="1592681239" name=""/>
+                    <pic:cNvPicPr/>
+                  </pic:nvPicPr>
+                  <pic:blipFill>
+                    <a:blip r:embed="rId11"/>
+                    <a:stretch>
+                      <a:fillRect/>
+                    </a:stretch>
+                  </pic:blipFill>
+                  <pic:spPr>
+                    <a:xfrm>
+                      <a:off x="0" y="0"/>
+                      <a:ext cx="2243694" cy="1729871"/>
+                    </a:xfrm>
+                    <a:prstGeom prst="rect">
+                      <a:avLst/>
+                    </a:prstGeom>
+                  </pic:spPr>
+                </pic:pic>
+              </a:graphicData>
+            </a:graphic>
+          </wp:inline>
+        </w:drawing>
+      </w:r>
+    </w:p>
+    <w:p>
+      <w:pPr>
+        <w:pStyle w:val="Caption"/>
+        <w:jc w:val="center"/>
+      </w:pPr>
+      <w:r>
+        <w:t xml:space="preserve">Figură </w:t>
+      </w:r>
+      <w:r>
+        <w:fldChar w:fldCharType="begin"/>
+      </w:r>
+      <w:r>
+        <w:instrText xml:space="preserve"> SEQ Figură \* ARABIC </w:instrText>
+      </w:r>
+      <w:r>
+        <w:fldChar w:fldCharType="separate"/>
+      </w:r>
+      <w:r>
+        <w:rPr>
+          <w:noProof/>
+        </w:rPr>
+        <w:t>4</w:t>
+      </w:r>
+      <w:r>
+        <w:fldChar w:fldCharType="end"/>
+      </w:r>
+      <w:r>
+        <w:t xml:space="preserve"> Exemplu de zgomot de tip speckle și </w:t>
+      </w:r>
+    </w:p>
+    <w:p>
+      <w:pPr>
+        <w:pStyle w:val="Caption"/>
+        <w:jc w:val="center"/>
+      </w:pPr>
+      <w:r>
+        <w:t xml:space="preserve"> de contrast intre 2 structuri (baza de date)</w:t>
+      </w:r>
+    </w:p>
+    <w:p>
+      <w:pPr>
+        <w:ind w:firstLine="720"/>
+      </w:pPr>
+      <w:r>
+        <w:t>Orientarea transductorului față de suprafața structurii examinate influențează direct calitatea conturului în imagine. Când unghiul de incidență nu este perpendicular pe suprafața structurii, ecoul returnat este slab sau absent, rezultând contururi incomplete în anumite zone. Acest fenomen, numit signal dropout, afectează în mod special structurile de dimensiuni mici, cum este artera ombilicală.</w:t>
+      </w:r>
+      <w:r>
+        <w:t xml:space="preserve"> </w:t>
+      </w:r>
+    </w:p>
+    <w:p>
+      <w:pPr>
+        <w:ind w:firstLine="720"/>
+      </w:pPr>
+      <w:r>
+        <w:t xml:space="preserve">Atenuarea semnalului cu adâncimea reprezintă o altă sursă de variabilitate. Undele ultrasonice își pierd din energie pe măsură ce traversează țesuturile, iar structurile situate mai adânc apar cu un contrast mai scăzut. În ecografiile prenatale, acest efect </w:t>
+      </w:r>
+      <w:r>
+        <w:t>poate fi accentuat</w:t>
+      </w:r>
+      <w:r>
+        <w:t xml:space="preserve"> de grosimea stratului adipos al mamei și de poziția fătului.</w:t>
+      </w:r>
+      <w:r>
+        <w:t xml:space="preserve"> </w:t>
+      </w:r>
+      <w:r>
+        <w:t>[6]</w:t>
+      </w:r>
+    </w:p>
+    <w:p>
+      <w:pPr>
+        <w:ind w:firstLine="720"/>
+      </w:pPr>
+    </w:p>
+    <w:p>
+      <w:pPr>
+        <w:pStyle w:val="Heading2"/>
+        <w:numPr>
+          <w:ilvl w:val="1"/>
+          <w:numId w:val="4"/>
+        </w:numPr>
+      </w:pPr>
+      <w:r>
+        <w:t>Provocări specifice imaginilor ecografice</w:t>
+      </w:r>
+    </w:p>
+    <w:p>
+      <w:pPr>
+        <w:ind w:firstLine="720"/>
+      </w:pPr>
+      <w:r>
+        <w:t>Ecografia este una dintre cele mai folosite metode de investigație medicală din lume, cu sute de milioane de examinări efectuate în fiecare an. În obstetrică, ecografia abdominală fetală face parte din monitorizarea standard a sarcinii, ceea ce înseamnă că numărul de imagini care ajung să fie interpretate zilnic este foarte mare.</w:t>
+      </w:r>
+      <w:r>
+        <w:t xml:space="preserve"> </w:t>
+      </w:r>
+      <w:r>
+        <w:t>[8]</w:t>
+      </w:r>
+    </w:p>
+    <w:p>
+      <w:pPr>
+        <w:ind w:firstLine="720"/>
+      </w:pPr>
+      <w:r>
+        <w:lastRenderedPageBreak/>
+        <w:t>Interpretarea rămâne un proces manual. Medicul se uită la imagine, identifică structurile și le delimitează pe baza experienței proprii. Problema e că doi medici pot ajunge la rezultate diferite pe aceeași imagine, mai ales când structurile sunt mici sau au un contrast slab față de țesuturile din jur.</w:t>
+      </w:r>
+      <w:r>
+        <w:t xml:space="preserve"> </w:t>
+      </w:r>
+      <w:r>
+        <w:t>Această variabilitate nu e neglijabilă și poate influența decizia clinică.</w:t>
+      </w:r>
+      <w:r>
+        <w:t xml:space="preserve"> </w:t>
+      </w:r>
+      <w:r>
+        <w:t>[7]</w:t>
+      </w:r>
+    </w:p>
+    <w:p>
+      <w:pPr>
+        <w:ind w:firstLine="720"/>
+      </w:pPr>
+      <w:r>
+        <w:t>Un sistem de segmentare automată nu rezolvă toate aceste probleme, dar poate reduce dependența de subiectivitatea operatorului. În cazurile clare, poate accelera fluxul de lucru. În cazurile dificile, poate oferi un punct de referință suplimentar, fără să înlocuiască judecata medicului. [7]</w:t>
+      </w:r>
+    </w:p>
+    <w:p>
+      <w:pPr>
+        <w:ind w:firstLine="720"/>
+      </w:pPr>
+      <w:r>
+        <w:t xml:space="preserve">Un alt aspect, mai puțin discutat, este înțelegerea imaginilor de către pacient. O ecografie în nuanțe de gri e greu de interpretat pentru cineva fără pregătire medicală. Structurile evidențiate prin măști de segmentare colorate fac rezultatul mai </w:t>
+      </w:r>
+      <w:r>
+        <w:t>vizibil</w:t>
+      </w:r>
+      <w:r>
+        <w:t xml:space="preserve"> și mai ușor de explicat în cabinet.</w:t>
+      </w:r>
+      <w:r>
+        <w:t xml:space="preserve"> </w:t>
+      </w:r>
+      <w:r>
+        <w:t>[7]</w:t>
+      </w:r>
+    </w:p>
+    <w:p>
+      <w:pPr>
+        <w:ind w:firstLine="720"/>
+      </w:pPr>
+    </w:p>
+    <w:p>
+      <w:pPr>
+        <w:pStyle w:val="Heading1"/>
+        <w:numPr>
+          <w:ilvl w:val="0"/>
+          <w:numId w:val="4"/>
+        </w:numPr>
+      </w:pPr>
+      <w:r>
+        <w:t>Stadiul actual al cercetării</w:t>
+      </w:r>
+    </w:p>
+    <w:p>
+      <w:pPr>
+        <w:pStyle w:val="Heading2"/>
+        <w:numPr>
+          <w:ilvl w:val="1"/>
+          <w:numId w:val="4"/>
+        </w:numPr>
+      </w:pPr>
+      <w:r>
+        <w:t xml:space="preserve">Segmentarea în imagistica medicală </w:t>
+      </w:r>
+      <w:r>
+        <w:t>-</w:t>
+      </w:r>
+      <w:r>
+        <w:t xml:space="preserve"> abordări clasice și moderne</w:t>
+      </w:r>
+    </w:p>
+    <w:p>
+      <w:pPr>
+        <w:ind w:firstLine="576"/>
+      </w:pPr>
+      <w:r>
+        <w:t>Segmentarea imaginilor medicale are o istorie îndelungată, iar metodele folosite de-a lungul timpului reflectă evoluția generală a procesării imaginilor și a inteligenței artificiale.</w:t>
+      </w:r>
+    </w:p>
+    <w:p>
+      <w:pPr>
+        <w:ind w:firstLine="720"/>
+      </w:pPr>
+      <w:r>
+        <w:t>Primele abordări, dezvoltate începând cu anii '70, se bazau pe procesarea la nivel de pixel: filtre de detecție a marginilor, algoritmi de region</w:t>
+      </w:r>
+      <w:r>
+        <w:t>-</w:t>
+      </w:r>
+      <w:r>
+        <w:t>growing și modele matematice simple. Sistemele construite astfel erau rigide și greu de generalizat, funcționând bine doar în condiții foarte specifice.</w:t>
+      </w:r>
+      <w:r>
+        <w:t xml:space="preserve"> </w:t>
+      </w:r>
+      <w:r>
+        <w:t>[</w:t>
+      </w:r>
+      <w:r>
+        <w:t>6</w:t>
+      </w:r>
+      <w:r>
+        <w:t>][7]</w:t>
+      </w:r>
+    </w:p>
+    <w:p>
+      <w:pPr>
+        <w:ind w:firstLine="720"/>
+      </w:pPr>
+      <w:r>
+        <w:t xml:space="preserve">Spre sfârșitul anilor </w:t>
+      </w:r>
+      <w:r>
+        <w:t>'90</w:t>
+      </w:r>
+      <w:r>
+        <w:t xml:space="preserve">, atenția s-a mutat spre metode supervizate, bazate pe extragerea manuală de trăsături și clasificatori statistici. </w:t>
+      </w:r>
+      <w:r>
+        <w:t>Modele a</w:t>
+      </w:r>
+      <w:r>
+        <w:t>ctive</w:t>
+      </w:r>
+      <w:r>
+        <w:t>-</w:t>
+      </w:r>
+      <w:r>
+        <w:t>shape</w:t>
+      </w:r>
+      <w:r>
+        <w:t xml:space="preserve"> </w:t>
+      </w:r>
+      <w:r>
+        <w:t>și</w:t>
+      </w:r>
+      <w:r>
+        <w:t xml:space="preserve"> </w:t>
+      </w:r>
+      <w:r>
+        <w:t>metodele bazate pe atlas</w:t>
+      </w:r>
+      <w:r>
+        <w:t xml:space="preserve"> </w:t>
+      </w:r>
+      <w:r>
+        <w:t>au devenit abordările standard pentru segmentarea structurilor anatomice. Aceste metode au dat rezultate bune în condiții controlate, dar rămâneau dependente de calitatea trăsăturilor extrase manual de cercetători.</w:t>
+      </w:r>
+      <w:r>
+        <w:t xml:space="preserve"> </w:t>
+      </w:r>
+      <w:r>
+        <w:t>[6][7]</w:t>
+      </w:r>
+    </w:p>
+    <w:p>
+      <w:pPr>
+        <w:ind w:firstLine="720"/>
+      </w:pPr>
+      <w:r>
+        <w:t xml:space="preserve">Pe imagini ecografice, limitările acestor metode sunt și mai evidente. Metodele bazate pe gradient de intensitate, </w:t>
+      </w:r>
+      <w:r>
+        <w:t>spre</w:t>
+      </w:r>
+      <w:r>
+        <w:t xml:space="preserve"> exemplu, funcționează bine pe imagini CT sau RMN, unde marginile structurilor sunt clare. Pe ecografii, speckle-ul generează răspunsuri false de gradient, atenuarea semnalului cu adâncimea slăbește marginile structurilor profunde, iar anizotropia achiziției poate duce la contururi lipsă. Autorii Noble și Boukerroui argumentează că, spre deosebire de CT și RMN, ecografia necesită metode </w:t>
+      </w:r>
+      <w:r>
+        <w:t>adaptate</w:t>
+      </w:r>
+      <w:r>
+        <w:t xml:space="preserve"> care să modeleze fizica achiziției.</w:t>
+      </w:r>
+      <w:r>
+        <w:t xml:space="preserve"> </w:t>
+      </w:r>
+      <w:r>
+        <w:t>[6][7]</w:t>
+      </w:r>
+    </w:p>
+    <w:p>
+      <w:pPr>
+        <w:ind w:firstLine="720"/>
+      </w:pPr>
+      <w:r>
+        <w:t>Momentul de cotitură a venit în 2012, odată cu succesul rețelei AlexNet la competiția ImageNet. CNN-urile au demonstrat că pot învăța automat trăsături relevante direct din date, eliminând necesitatea extragerii manuale. Tranziția în imagistica medicală a fost graduală, dar rapidă, iar dintr-un survey din 2017 care analizează peste 300 de lucrări reiese că CNN-urile antrenate</w:t>
+      </w:r>
+      <w:r>
+        <w:t xml:space="preserve"> </w:t>
+      </w:r>
+      <w:r>
+        <w:t>au devenit abordarea dominantă, înlocuind metodele clasice în majoritatea aplicațiilor.</w:t>
+      </w:r>
+      <w:r>
+        <w:t xml:space="preserve"> </w:t>
+      </w:r>
+      <w:r>
+        <w:t>[6][7]</w:t>
+      </w:r>
+    </w:p>
+    <w:p>
+      <w:pPr>
+        <w:ind w:firstLine="720"/>
+      </w:pPr>
+      <w:r>
+        <w:t xml:space="preserve">La competițiile majore de segmentare medicală, BRATS pentru tumori cerebrale, ISLES pentru accidente vasculare, LUNA16 pentru noduli pulmonari, echipele de top au folosit </w:t>
+      </w:r>
+      <w:r>
+        <w:lastRenderedPageBreak/>
+        <w:t>în toate cazurile arhitecturi bazate pe CNN-uri. Un aspect important subliniat în literatură este că arhitectura exactă a rețelei nu este factorul decisiv, ci tehnicile de preprocesare și augmentare a datelor fac adesea diferența între rezultate slabe și rezultate bune.</w:t>
+      </w:r>
+      <w:r>
+        <w:t xml:space="preserve"> </w:t>
+      </w:r>
+      <w:r>
+        <w:t>[6][7]</w:t>
+      </w:r>
+    </w:p>
+    <w:p>
+      <w:pPr>
+        <w:pStyle w:val="Heading2"/>
+        <w:numPr>
+          <w:ilvl w:val="1"/>
+          <w:numId w:val="4"/>
+        </w:numPr>
+      </w:pPr>
+      <w:r>
+        <w:t xml:space="preserve"> </w:t>
+      </w:r>
+      <w:r>
+        <w:t>Arhitecturi de</w:t>
+      </w:r>
+      <w:r>
+        <w:t xml:space="preserve"> </w:t>
+      </w:r>
+      <w:r>
+        <w:t>tip encoder-decoder pentru</w:t>
+      </w:r>
+      <w:r>
+        <w:t xml:space="preserve"> </w:t>
+      </w:r>
+      <w:r>
+        <w:t>segmentare</w:t>
+      </w:r>
+    </w:p>
+    <w:p>
+      <w:pPr>
+        <w:ind w:firstLine="576"/>
+      </w:pPr>
+      <w:r>
+        <w:t>Arhitecturile de tip encoder-decoder sunt în prezent abordarea standard pentru segmentarea semantică în imagistica medicală. Procesul e împărțit în două etape: o cale de contracție, care extrage trăsături din imagine la rezoluții din ce în ce mai mici, și o cale de expansiune, care reconstruiește harta de segmentare la rezoluția originală.</w:t>
+      </w:r>
+    </w:p>
+    <w:p>
+      <w:pPr>
+        <w:ind w:firstLine="576"/>
+      </w:pPr>
+      <w:r>
+        <w:t>U-Net, propus de Ronneberger et al. în 2015, a devenit arhitectura de referință în domeniu.</w:t>
+      </w:r>
+      <w:r>
+        <w:t xml:space="preserve"> </w:t>
+      </w:r>
+      <w:r>
+        <w:t>Calea de contracție funcționează ca un encoder clasic, captând contextul imaginii prin convoluții și operații de pooling. Calea de expansiune înlocuiește operațiile de pooling cu upsampling, mărind progresiv rezoluția ieșirii. O particularitate importantă a arhitecturii este absența straturilor fully connected, rețeaua operând exclusiv cu convoluții.</w:t>
+      </w:r>
+      <w:r>
+        <w:t xml:space="preserve"> </w:t>
+      </w:r>
+      <w:r>
+        <w:t>[9][</w:t>
+      </w:r>
+      <w:r>
+        <w:t>10</w:t>
+      </w:r>
+      <w:r>
+        <w:t>]</w:t>
+      </w:r>
+    </w:p>
+    <w:p>
+      <w:pPr>
+        <w:keepNext/>
+        <w:jc w:val="center"/>
+      </w:pPr>
+      <w:r>
+        <w:drawing>
+          <wp:inline distT="0" distB="0" distL="0" distR="0" wp14:anchorId="32EE9E03" wp14:editId="517CB784">
+            <wp:extent cx="3172570" cy="2073804"/>
+            <wp:effectExtent l="0" t="0" r="0" b="3175"/>
+            <wp:docPr id="54037805" name="Picture 1"/>
+            <wp:cNvGraphicFramePr>
+              <a:graphicFrameLocks xmlns:a="http://schemas.openxmlformats.org/drawingml/2006/main" noChangeAspect="1"/>
+            </wp:cNvGraphicFramePr>
+            <a:graphic xmlns:a="http://schemas.openxmlformats.org/drawingml/2006/main">
+              <a:graphicData uri="http://schemas.openxmlformats.org/drawingml/2006/picture">
+                <pic:pic xmlns:pic="http://schemas.openxmlformats.org/drawingml/2006/picture">
+                  <pic:nvPicPr>
+                    <pic:cNvPr id="54037805" name=""/>
+                    <pic:cNvPicPr/>
+                  </pic:nvPicPr>
+                  <pic:blipFill>
+                    <a:blip r:embed="rId12"/>
+                    <a:stretch>
+                      <a:fillRect/>
+                    </a:stretch>
+                  </pic:blipFill>
+                  <pic:spPr>
+                    <a:xfrm>
+                      <a:off x="0" y="0"/>
+                      <a:ext cx="3189488" cy="2084863"/>
+                    </a:xfrm>
+                    <a:prstGeom prst="rect">
+                      <a:avLst/>
+                    </a:prstGeom>
+                  </pic:spPr>
+                </pic:pic>
+              </a:graphicData>
+            </a:graphic>
+          </wp:inline>
+        </w:drawing>
+      </w:r>
+    </w:p>
+    <w:p>
+      <w:pPr>
+        <w:pStyle w:val="Caption"/>
+        <w:jc w:val="center"/>
+      </w:pPr>
+      <w:r>
+        <w:t xml:space="preserve">Figură </w:t>
+      </w:r>
+      <w:r>
+        <w:fldChar w:fldCharType="begin"/>
+      </w:r>
+      <w:r>
+        <w:instrText xml:space="preserve"> SEQ Figură \* ARABIC </w:instrText>
+      </w:r>
+      <w:r>
+        <w:fldChar w:fldCharType="separate"/>
+      </w:r>
+      <w:r>
+        <w:rPr>
+          <w:noProof/>
+        </w:rPr>
+        <w:t>5</w:t>
+      </w:r>
+      <w:r>
+        <w:fldChar w:fldCharType="end"/>
+      </w:r>
+      <w:r>
+        <w:t xml:space="preserve"> Model de rețea U-Net [9]</w:t>
+      </w:r>
+    </w:p>
+    <w:p>
+      <w:pPr>
+        <w:ind w:firstLine="720"/>
+      </w:pPr>
+      <w:r>
+        <w:t>Elementul cheie al U-Net sunt skip connections, conexiuni directe între straturile corespondente din encoder și decoder. Prin acestea, trăsăturile de înaltă rezoluție din calea de contracție sunt concatenate cu ieșirea</w:t>
+      </w:r>
+      <w:r>
+        <w:t xml:space="preserve"> pe care s-a făcut</w:t>
+      </w:r>
+      <w:r>
+        <w:t xml:space="preserve"> upsample din calea de expansiune, permițând rețelei să combine informația de context cu informația spațială precisă. Fără aceste conexiuni, detaliile fine ale contururilor s-ar pierde în procesul de downsampling</w:t>
+      </w:r>
+      <w:r>
+        <w:t xml:space="preserve">. </w:t>
+      </w:r>
+      <w:r>
+        <w:t>[9][10]</w:t>
+      </w:r>
+    </w:p>
+    <w:p>
+      <w:pPr>
+        <w:ind w:firstLine="720"/>
+      </w:pPr>
+      <w:r>
+        <w:t>Pentru encoderul arhitecturii propuse în lucrarea de față s-a folosit ResNet50, propus de He et al. în 2015. Motivul pentru care ResNet a reprezentat un pas important ține de o problemă concretă: pe măsură ce rețelele devin mai adânci, eroarea de antrenare crește în loc să scadă, fenomen care nu se explică prin overfitting.</w:t>
+      </w:r>
+      <w:r>
+        <w:t xml:space="preserve"> </w:t>
+      </w:r>
+      <w:r>
+        <w:t>[9][10]</w:t>
+      </w:r>
+    </w:p>
+    <w:p>
+      <w:pPr>
+        <w:ind w:firstLine="720"/>
+      </w:pPr>
+      <w:r>
+        <w:t>Blocul rezidual rezolvă problema prin învățarea reziduului față de identitate. În loc să înveț</w:t>
+      </w:r>
+      <w:r>
+        <w:t>e</w:t>
+      </w:r>
+      <w:r>
+        <w:t xml:space="preserve"> direct transformarea H(x), rețeaua învață F(x) = H(x) - x, iar ieșirea finală e F(x) + x. </w:t>
+      </w:r>
+      <w:r>
+        <w:t>S</w:t>
+      </w:r>
+      <w:r>
+        <w:t>traturile convoluționale învață doar ce trebuie adăugat peste intrare, nu întreaga transformare de la zero. Această idee simplă, implementată prin shortcut connections care adună intrarea direct peste ieșirea blocului, face antrenarea rețelelor foarte adânci stabilă și eficientă, fără a adăuga parametri sau complexitate computațională suplimentară.</w:t>
+      </w:r>
+      <w:r>
+        <w:t xml:space="preserve"> </w:t>
+      </w:r>
+      <w:r>
+        <w:t>[9][10]</w:t>
+      </w:r>
+    </w:p>
+    <w:p>
+      <w:pPr>
+        <w:ind w:firstLine="720"/>
+      </w:pPr>
+    </w:p>
+    <w:p>
+      <w:pPr>
+        <w:pStyle w:val="Heading2"/>
+        <w:numPr>
+          <w:ilvl w:val="1"/>
+          <w:numId w:val="4"/>
+        </w:numPr>
+      </w:pPr>
+      <w:r>
+        <w:lastRenderedPageBreak/>
+        <w:t xml:space="preserve"> Segmentarea pe imagini ecografice</w:t>
+      </w:r>
+    </w:p>
+    <w:p>
+      <w:pPr>
+        <w:ind w:firstLine="576"/>
+      </w:pPr>
+      <w:r>
+        <w:t xml:space="preserve">Imaginile ecografice prezintă o serie de particularități care le fac mai dificil de procesat față de alte modalități imagistice medicale, cum ar fi CT sau RMN. </w:t>
+      </w:r>
+      <w:r>
+        <w:t>Imaginile ecografice au un raport semnal-zgomot scăzut și sunt afectate frecvent de artefacte de tip acoustic shadowing, mai ales în apropierea structurilor osoase. Contrastul dintre structura de interes și țesuturile din jur este de multe ori insuficient pentru o delimitare clară. La acestea se adaugă variabilitatea introdusă de echipament și de operator, care face ca imaginile să difere semnificativ de la o examinare la alta.</w:t>
+      </w:r>
+    </w:p>
+    <w:p>
+      <w:pPr>
+        <w:ind w:firstLine="576"/>
+      </w:pPr>
+      <w:r>
+        <w:t>Baumgartner et al. [11] arată că această variabilitate are un impact direct asupra modelelor antrenate: un model care funcționează bine pe imagini de la un anumit echipament sau operator nu se transferă neapărat la alt context de achiziție.</w:t>
+      </w:r>
+      <w:r>
+        <w:t xml:space="preserve"> </w:t>
+      </w:r>
+      <w:r>
+        <w:t>Autorii raportează că ghidarea transducerului la planul corect de scanare, prin anatomia înalt variabilă a pacientului, necesită ani de pregătire și produce reproductibilitate scăzută chiar și în rândul specialiștilor experimentați.</w:t>
+      </w:r>
+      <w:r>
+        <w:t xml:space="preserve"> </w:t>
+      </w:r>
+      <w:r>
+        <w:t>[11]</w:t>
+      </w:r>
+    </w:p>
+    <w:p>
+      <w:pPr>
+        <w:ind w:firstLine="576"/>
+      </w:pPr>
+      <w:r>
+        <w:t>Pe lângă aceste aspecte tehnice, imaginile ecografice fetale introduc un nivel suplimentar de complexitate. Poziția fătului poate face imposibilă obținerea unui plan de scanare clar pentru anumite structuri. Burgos-Artizzu et al. menționează explicit că variabilitatea intra-clasă ridicată și dezechilibrul compozițional al seturilor de date reflectă direct condițiile dintr-un scenariu clinic real, nu limitări ale procesului de colectare.</w:t>
+      </w:r>
+      <w:r>
+        <w:t xml:space="preserve"> </w:t>
+      </w:r>
+      <w:r>
+        <w:t>[12]</w:t>
+      </w:r>
+    </w:p>
+    <w:p>
+      <w:pPr>
+        <w:ind w:firstLine="576"/>
+      </w:pPr>
+      <w:r>
+        <w:t>Utilizarea rețelelor convoluționale pe imagini ecografice rămâne mai puțin studiată față de alte modalități imagistice. Totuși, rezultatele recente arată că arhitecturile CNN pot atinge performanțe comparabile cu cele ale specialiștilor umani pe anumite sarcini. SonoNet, arhitectura propusă de Baumgartner et al., bazată pe VGG16 și adaptată pentru detecție în timp real, obține un F1-score mediu de 0,798 pe detecția planurilor standard fetale dintr-un flux video continuu. Burgos-Artizzu et al. raportează o acuratețe medie de 93,6% pentru clasificarea planurilor comune, obținută cu DenseNet-169, performanță similară cu cea a tehnicienilor evaluați în același studiu.</w:t>
+      </w:r>
+      <w:r>
+        <w:t xml:space="preserve"> </w:t>
+      </w:r>
+      <w:r>
+        <w:t>[11]</w:t>
+      </w:r>
+      <w:r>
+        <w:t xml:space="preserve"> </w:t>
+      </w:r>
+      <w:r>
+        <w:t>[12]</w:t>
+      </w:r>
+    </w:p>
+    <w:p>
+      <w:pPr>
+        <w:ind w:firstLine="576"/>
+      </w:pPr>
+      <w:r>
+        <w:t>Aceste rezultate sunt obținute însă pe sarcini de clasificare sau detecție, nu de segmentare propriu-zisă. Segmentarea pixel cu pixel pe imagini ecografice rămâne o problemă mai dificilă, mai ales când structurile de interes sunt mici, cu contur slab definit sau parțial ascunse de artefacte. Acesta este și cazul lucrării de față, unde structuri cu dimensiuni foarte diferite, cum ar fi artera ombilicală și ficatul fetal, trebuie segmentate simultan din aceeași imagine.</w:t>
+      </w:r>
+      <w:r>
+        <w:t xml:space="preserve"> </w:t>
+      </w:r>
+      <w:r>
+        <w:t>[11] [12]</w:t>
+      </w:r>
+    </w:p>
+    <w:p>
+      <w:pPr>
+        <w:ind w:firstLine="576"/>
+      </w:pPr>
+    </w:p>
+    <w:p>
+      <w:pPr>
+        <w:pStyle w:val="Heading2"/>
+        <w:numPr>
+          <w:ilvl w:val="1"/>
+          <w:numId w:val="4"/>
+        </w:numPr>
+      </w:pPr>
+      <w:r>
+        <w:t xml:space="preserve">Segmentarea structurilor fetale </w:t>
+      </w:r>
+      <w:r>
+        <w:t>-</w:t>
+      </w:r>
+      <w:r>
+        <w:t xml:space="preserve"> particularități și lucrări existente</w:t>
+      </w:r>
+    </w:p>
+    <w:p/>
+    <w:p>
+      <w:pPr>
+        <w:ind w:firstLine="720"/>
+      </w:pPr>
+      <w:r>
+        <w:t>Segmentarea automată a structurilor fetale din imagini ecografice este un domeniu relativ restrâns în literatura de specialitate. Majoritatea lucrărilor existente se concentrează pe măsurători biometrice standard - circumferința craniană, circumferința abdominală, lungimea femurului -</w:t>
+      </w:r>
+      <w:r>
+        <w:t xml:space="preserve"> </w:t>
+      </w:r>
+      <w:r>
+        <w:t>și nu pe segmentarea structurilor interne. Lucrări care abordează explicit segmentarea venei sau arterei ombilicale în imagini 2D nu au fost identificate în literatura consultată.</w:t>
+      </w:r>
+      <w:r>
+        <w:t xml:space="preserve"> </w:t>
+      </w:r>
+      <w:r>
+        <w:t>[</w:t>
+      </w:r>
+      <w:r>
+        <w:t>13</w:t>
+      </w:r>
+      <w:r>
+        <w:t>]</w:t>
+      </w:r>
+    </w:p>
+    <w:p>
+      <w:pPr>
+        <w:ind w:firstLine="720"/>
+      </w:pPr>
+      <w:r>
+        <w:lastRenderedPageBreak/>
+        <w:t>Metodele clasice de segmentare, precum region growing, active contours sau threshold segmentation, s-au dovedit fragile pe imagini ecografice, din cauza zgomotului ridicat și a contrastului scăzut. Abordările bazate pe rețele convoluționale au adus îmbunătățiri clare, U-Net devenind arhitectura de referință pentru segmentarea în imagistica medicală.</w:t>
+      </w:r>
+      <w:r>
+        <w:t xml:space="preserve"> </w:t>
+      </w:r>
+      <w:r>
+        <w:t>[13]</w:t>
+      </w:r>
+    </w:p>
+    <w:p>
+      <w:pPr>
+        <w:ind w:firstLine="720"/>
+      </w:pPr>
+      <w:r>
+        <w:t>Liu et al. [13] propun AFG-net, o variantă modificată de U-Net cu module de attention fusion și guide filter, aplicată pe segmentarea sacului gestațional, sacului vitelin și embrionului în ecografii transvaginale din trimestrul I. Rețeaua obține un Dice mediu de 92,11% pe cele trei structuri, față de 89,67% pentru U-Net standard. Autorii observă că operațiile repetate de down-sampling reduc rezoluția și afectează segmentarea structurilor mici - embrionul, cea mai mică structură din set, înregistrează cel mai mic Dice, 86,11%.</w:t>
+      </w:r>
+      <w:r>
+        <w:t xml:space="preserve"> </w:t>
+      </w:r>
+      <w:r>
+        <w:t>[13]</w:t>
+      </w:r>
+    </w:p>
+    <w:p>
+      <w:pPr>
+        <w:ind w:firstLine="720"/>
+      </w:pPr>
+      <w:r>
+        <w:t>Problema diferenței de scară apare și în lucrarea de față, dar mai accentuat. Ficatul fetal ocupă o parte semnificativă din imagine, în timp ce artera ombilicală poate fi de zeci de ori mai mică. O arhitectură care nu tratează acest dezechilibru va performa bine pe structurile mari și slab pe cele mici.</w:t>
+      </w:r>
+      <w:r>
+        <w:t xml:space="preserve"> </w:t>
+      </w:r>
+      <w:r>
+        <w:t>[13]</w:t>
+      </w:r>
+    </w:p>
+    <w:p>
+      <w:pPr>
+        <w:ind w:firstLine="720"/>
+      </w:pPr>
+      <w:r>
+        <w:t>Liu et al. menționează și variabilitatea inter-observator ca limitare: sonografi diferiți pot produce contururi diferite pentru aceleași structuri, ceea ce introduce incertitudine în ground truth-ul folosit la antrenare. Această problemă este comună în domeniu și afectează direct interpretarea metricilor raportate.</w:t>
+      </w:r>
+      <w:r>
+        <w:t xml:space="preserve"> </w:t>
+      </w:r>
+      <w:r>
+        <w:t>[13]</w:t>
+      </w:r>
+    </w:p>
+    <w:p>
+      <w:pPr>
+        <w:keepNext/>
+        <w:ind w:firstLine="720"/>
+        <w:jc w:val="center"/>
+      </w:pPr>
+      <w:r>
+        <w:drawing>
+          <wp:inline distT="0" distB="0" distL="0" distR="0" wp14:anchorId="2E0D03F7" wp14:editId="2E556CE4">
+            <wp:extent cx="3233318" cy="2466005"/>
+            <wp:effectExtent l="0" t="0" r="5715" b="0"/>
+            <wp:docPr id="1284603859" name="Picture 1"/>
+            <wp:cNvGraphicFramePr>
+              <a:graphicFrameLocks xmlns:a="http://schemas.openxmlformats.org/drawingml/2006/main" noChangeAspect="1"/>
+            </wp:cNvGraphicFramePr>
+            <a:graphic xmlns:a="http://schemas.openxmlformats.org/drawingml/2006/main">
+              <a:graphicData uri="http://schemas.openxmlformats.org/drawingml/2006/picture">
+                <pic:pic xmlns:pic="http://schemas.openxmlformats.org/drawingml/2006/picture">
+                  <pic:nvPicPr>
+                    <pic:cNvPr id="1284603859" name=""/>
+                    <pic:cNvPicPr/>
+                  </pic:nvPicPr>
+                  <pic:blipFill>
+                    <a:blip r:embed="rId13"/>
+                    <a:stretch>
+                      <a:fillRect/>
+                    </a:stretch>
+                  </pic:blipFill>
+                  <pic:spPr>
+                    <a:xfrm>
+                      <a:off x="0" y="0"/>
+                      <a:ext cx="3247097" cy="2476514"/>
+                    </a:xfrm>
+                    <a:prstGeom prst="rect">
+                      <a:avLst/>
+                    </a:prstGeom>
+                  </pic:spPr>
+                </pic:pic>
+              </a:graphicData>
+            </a:graphic>
+          </wp:inline>
+        </w:drawing>
+      </w:r>
+    </w:p>
+    <w:p>
+      <w:pPr>
+        <w:pStyle w:val="Caption"/>
+        <w:jc w:val="center"/>
+      </w:pPr>
+      <w:r>
+        <w:t xml:space="preserve">Figură </w:t>
+      </w:r>
+      <w:r>
+        <w:fldChar w:fldCharType="begin"/>
+      </w:r>
+      <w:r>
+        <w:instrText xml:space="preserve"> SEQ Figură \* ARABIC </w:instrText>
+      </w:r>
+      <w:r>
+        <w:fldChar w:fldCharType="separate"/>
+      </w:r>
+      <w:r>
+        <w:rPr>
+          <w:noProof/>
+        </w:rPr>
+        <w:t>6</w:t>
+      </w:r>
+      <w:r>
+        <w:fldChar w:fldCharType="end"/>
+      </w:r>
+      <w:r>
+        <w:t xml:space="preserve"> Rezultatele obtinuțe cu diferite arhitecturi de Liu et al. </w:t>
+      </w:r>
+      <w:r>
+        <w:t>[13]</w:t>
+      </w:r>
+      <w:r>
+        <w:t xml:space="preserve"> </w:t>
+      </w:r>
+    </w:p>
+    <w:p>
+      <w:pPr>
+        <w:ind w:firstLine="720"/>
+      </w:pPr>
+    </w:p>
+    <w:p>
+      <w:pPr>
+        <w:ind w:firstLine="720"/>
+      </w:pPr>
+    </w:p>
+    <w:p>
+      <w:pPr>
+        <w:ind w:firstLine="720"/>
+      </w:pPr>
+    </w:p>
+    <w:p>
+      <w:pPr>
+        <w:ind w:firstLine="720"/>
+      </w:pPr>
+    </w:p>
+    <w:p>
+      <w:pPr>
+        <w:ind w:firstLine="720"/>
+      </w:pPr>
+    </w:p>
+    <w:p>
+      <w:pPr>
+        <w:ind w:firstLine="720"/>
+      </w:pPr>
+    </w:p>
+    <w:p>
+      <w:pPr>
+        <w:ind w:firstLine="720"/>
+      </w:pPr>
+    </w:p>
+    <w:p>
+      <w:pPr>
+        <w:ind w:firstLine="720"/>
+      </w:pPr>
+    </w:p>
+    <w:p>
+      <w:pPr>
+        <w:ind w:firstLine="720"/>
+      </w:pPr>
+    </w:p>
+    <w:p>
+      <w:pPr>
+        <w:ind w:firstLine="720"/>
+      </w:pPr>
+    </w:p>
+    <w:p>
+      <w:pPr>
+        <w:ind w:firstLine="720"/>
+      </w:pPr>
+    </w:p>
+    <w:p>
+      <w:pPr>
+        <w:ind w:firstLine="720"/>
+      </w:pPr>
+    </w:p>
+    <w:p>
+      <w:pPr>
+        <w:ind w:firstLine="720"/>
+      </w:pPr>
+    </w:p>
+    <w:p>
+      <w:pPr>
+        <w:ind w:firstLine="720"/>
+      </w:pPr>
+    </w:p>
+    <w:p>
+      <w:pPr>
+        <w:ind w:firstLine="720"/>
+      </w:pPr>
+    </w:p>
+    <w:p>
+      <w:pPr>
+        <w:ind w:firstLine="720"/>
+      </w:pPr>
+    </w:p>
+    <w:p>
+      <w:pPr>
+        <w:ind w:firstLine="720"/>
+      </w:pPr>
+    </w:p>
+    <w:p>
+      <w:pPr>
+        <w:ind w:firstLine="720"/>
+      </w:pPr>
+    </w:p>
+    <w:p>
+      <w:pPr>
+        <w:pStyle w:val="Heading1"/>
+        <w:numPr>
+          <w:ilvl w:val="0"/>
+          <w:numId w:val="4"/>
+        </w:numPr>
+      </w:pPr>
+      <w:r>
+        <w:t>Stadiul actual al cercetării</w:t>
+      </w:r>
+    </w:p>
+    <w:p/>
+    <w:p/>
+    <w:p/>
+    <w:p>
+      <w:pPr>
+        <w:pStyle w:val="Heading2"/>
+        <w:numPr>
+          <w:ilvl w:val="1"/>
+          <w:numId w:val="4"/>
+        </w:numPr>
+      </w:pPr>
+      <w:r>
+        <w:t>Chapter 2 subtitle 1</w:t>
+      </w:r>
+    </w:p>
+    <w:p>
+      <w:pPr>
+        <w:pStyle w:val="Heading1"/>
+        <w:numPr>
+          <w:ilvl w:val="0"/>
+          <w:numId w:val="4"/>
+        </w:numPr>
+      </w:pPr>
+      <w:r>
+        <w:t>Stadiul actual al cercetării</w:t>
+      </w:r>
+    </w:p>
+    <w:p/>
+    <w:p/>
+    <w:p/>
+    <w:p>
+      <w:pPr>
+        <w:pStyle w:val="Heading2"/>
+        <w:numPr>
+          <w:ilvl w:val="1"/>
+          <w:numId w:val="4"/>
+        </w:numPr>
+      </w:pPr>
+      <w:r>
+        <w:t>Chapter 2 subtitle 1</w:t>
+      </w:r>
+    </w:p>
+    <w:p>
+      <w:pPr>
+        <w:pStyle w:val="Heading1"/>
+        <w:numPr>
+          <w:ilvl w:val="0"/>
+          <w:numId w:val="4"/>
+        </w:numPr>
+      </w:pPr>
+      <w:r>
+        <w:t>Stadiul actual al cercetării</w:t>
+      </w:r>
+    </w:p>
+    <w:p/>
+    <w:p/>
+    <w:p/>
+    <w:p>
+      <w:pPr>
+        <w:pStyle w:val="Heading2"/>
+        <w:numPr>
+          <w:ilvl w:val="1"/>
+          <w:numId w:val="4"/>
+        </w:numPr>
+      </w:pPr>
+      <w:r>
+        <w:t>Chapter 2 subtitle 1</w:t>
+      </w:r>
+    </w:p>
+    <w:p>
+      <w:pPr>
+        <w:pStyle w:val="Heading1"/>
+        <w:numPr>
+          <w:ilvl w:val="0"/>
+          <w:numId w:val="4"/>
+        </w:numPr>
+      </w:pPr>
+      <w:r>
+        <w:t>Stadiul actual al cercetării</w:t>
+      </w:r>
+    </w:p>
+    <w:p/>
+    <w:p/>
+    <w:p/>
+    <w:p>
+      <w:pPr>
+        <w:pStyle w:val="Heading2"/>
+        <w:numPr>
+          <w:ilvl w:val="1"/>
+          <w:numId w:val="4"/>
+        </w:numPr>
+      </w:pPr>
+      <w:r>
+        <w:lastRenderedPageBreak/>
+        <w:t>Chapter 2 subtitle 1</w:t>
+      </w:r>
+    </w:p>
+    <w:p>
+      <w:pPr>
+        <w:pStyle w:val="Heading1"/>
+        <w:numPr>
+          <w:ilvl w:val="0"/>
+          <w:numId w:val="4"/>
+        </w:numPr>
+      </w:pPr>
+      <w:r>
+        <w:t>Stadiul actual al cercetării</w:t>
+      </w:r>
+    </w:p>
+    <w:p/>
+    <w:p/>
+    <w:p/>
+    <w:p>
+      <w:pPr>
+        <w:pStyle w:val="Heading2"/>
+        <w:numPr>
+          <w:ilvl w:val="1"/>
+          <w:numId w:val="4"/>
+        </w:numPr>
+      </w:pPr>
+      <w:r>
+        <w:t>Chapter 2 subtitle 1</w:t>
+      </w:r>
+    </w:p>
+    <w:p>
+      <w:pPr>
+        <w:ind w:firstLine="720"/>
+      </w:pPr>
+    </w:p>
+    <w:p>
+      <w:pPr>
+        <w:ind w:firstLine="432"/>
+      </w:pPr>
+    </w:p>
+    <w:p>
+      <w:pPr>
+        <w:ind w:firstLine="432"/>
+      </w:pPr>
+    </w:p>
+    <w:p>
+      <w:pPr>
+        <w:ind w:firstLine="720"/>
+      </w:pPr>
       <w:r>
         <w:br w:type="page"/>
       </w:r>
@@ -3973,44 +5187,10 @@
           <w:docGrid w:linePitch="360"/>
         </w:sectPr>
       </w:pPr>
-    </w:p>
-    <w:p>
-      <w:pPr>
-        <w:pStyle w:val="Heading1"/>
-        <w:numPr>
-          <w:ilvl w:val="0"/>
-          <w:numId w:val="4"/>
-        </w:numPr>
-      </w:pPr>
-      <w:bookmarkStart w:id="8" w:name="_Toc206594662"/>
       <w:r>
         <w:lastRenderedPageBreak/>
-        <w:t>Chapter 2</w:t>
-      </w:r>
-      <w:r>
-        <w:t>:</w:t>
-      </w:r>
-      <w:r>
-        <w:t xml:space="preserve"> title</w:t>
-      </w:r>
-      <w:bookmarkEnd w:id="8"/>
-    </w:p>
-    <w:p/>
-    <w:p/>
-    <w:p/>
-    <w:p>
-      <w:pPr>
-        <w:pStyle w:val="Heading2"/>
-        <w:numPr>
-          <w:ilvl w:val="1"/>
-          <w:numId w:val="4"/>
-        </w:numPr>
-      </w:pPr>
-      <w:bookmarkStart w:id="9" w:name="_Toc206594663"/>
-      <w:r>
-        <w:t>Chapter 2 subtitle 1</w:t>
-      </w:r>
-      <w:bookmarkEnd w:id="9"/>
+        <w:tab/>
+      </w:r>
     </w:p>
     <w:p/>
     <w:p/>
@@ -4045,12 +5225,12 @@
         </w:numPr>
         <w:ind w:left="540" w:hanging="540"/>
       </w:pPr>
-      <w:bookmarkStart w:id="10" w:name="_Toc206594664"/>
+      <w:bookmarkStart w:id="8" w:name="_Toc206594664"/>
       <w:r>
         <w:lastRenderedPageBreak/>
         <w:t>Project Conclusions</w:t>
       </w:r>
-      <w:bookmarkEnd w:id="10"/>
+      <w:bookmarkEnd w:id="8"/>
     </w:p>
     <w:p/>
     <w:p/>
@@ -4063,11 +5243,11 @@
         </w:numPr>
         <w:ind w:left="360" w:hanging="360"/>
       </w:pPr>
-      <w:bookmarkStart w:id="11" w:name="_Toc206594665"/>
+      <w:bookmarkStart w:id="9" w:name="_Toc206594665"/>
       <w:r>
         <w:t>Conclusions</w:t>
       </w:r>
-      <w:bookmarkEnd w:id="11"/>
+      <w:bookmarkEnd w:id="9"/>
     </w:p>
     <w:p/>
     <w:p/>
@@ -4081,11 +5261,11 @@
         </w:numPr>
         <w:ind w:left="360" w:hanging="360"/>
       </w:pPr>
-      <w:bookmarkStart w:id="12" w:name="_Toc206594666"/>
+      <w:bookmarkStart w:id="10" w:name="_Toc206594666"/>
       <w:r>
         <w:t>Personal contributions</w:t>
       </w:r>
-      <w:bookmarkEnd w:id="12"/>
+      <w:bookmarkEnd w:id="10"/>
     </w:p>
     <w:p/>
     <w:p/>
@@ -4099,11 +5279,11 @@
         </w:numPr>
         <w:ind w:left="360" w:hanging="360"/>
       </w:pPr>
-      <w:bookmarkStart w:id="13" w:name="_Toc206594667"/>
+      <w:bookmarkStart w:id="11" w:name="_Toc206594667"/>
       <w:r>
         <w:t>Future work</w:t>
       </w:r>
-      <w:bookmarkEnd w:id="13"/>
+      <w:bookmarkEnd w:id="11"/>
     </w:p>
     <w:p/>
     <w:p/>
@@ -4136,11 +5316,8 @@
         </w:numPr>
         <w:ind w:left="540" w:hanging="540"/>
       </w:pPr>
-      <w:bookmarkStart w:id="14" w:name="_Toc206594668"/>
-      <w:r>
-        <w:rPr>
-          <w:noProof/>
-        </w:rPr>
+      <w:bookmarkStart w:id="12" w:name="_Toc206594668"/>
+      <w:r>
         <w:lastRenderedPageBreak/>
         <mc:AlternateContent>
           <mc:Choice Requires="wps">
@@ -4252,7 +5429,7 @@
       <w:r>
         <w:t>ibliography</w:t>
       </w:r>
-      <w:bookmarkEnd w:id="14"/>
+      <w:bookmarkEnd w:id="12"/>
     </w:p>
     <w:p/>
     <w:p>
@@ -4278,7 +5455,7 @@
           <w:numId w:val="5"/>
         </w:numPr>
       </w:pPr>
-      <w:hyperlink r:id="rId12" w:history="1">
+      <w:hyperlink r:id="rId14" w:history="1">
         <w:r>
           <w:rPr>
             <w:rStyle w:val="Hyperlink"/>
@@ -4287,10 +5464,7 @@
         </w:r>
       </w:hyperlink>
       <w:r>
-        <w:t xml:space="preserve"> </w:t>
-      </w:r>
-      <w:r>
-        <w:t>accesat la data 13/05/2026</w:t>
+        <w:t xml:space="preserve"> accesat la data 13/05/2026</w:t>
       </w:r>
     </w:p>
     <w:p>
@@ -4302,7 +5476,7 @@
         </w:numPr>
         <w:ind w:left="900" w:hanging="540"/>
       </w:pPr>
-      <w:hyperlink r:id="rId13" w:history="1">
+      <w:hyperlink r:id="rId15" w:history="1">
         <w:r>
           <w:rPr>
             <w:rStyle w:val="Hyperlink"/>
@@ -4323,7 +5497,7 @@
         </w:numPr>
         <w:ind w:left="900" w:hanging="540"/>
       </w:pPr>
-      <w:hyperlink r:id="rId14" w:history="1">
+      <w:hyperlink r:id="rId16" w:history="1">
         <w:r>
           <w:rPr>
             <w:rStyle w:val="Hyperlink"/>
@@ -4344,7 +5518,7 @@
         </w:numPr>
         <w:ind w:left="900" w:hanging="540"/>
       </w:pPr>
-      <w:hyperlink r:id="rId15" w:history="1">
+      <w:hyperlink r:id="rId17" w:history="1">
         <w:r>
           <w:rPr>
             <w:rStyle w:val="Hyperlink"/>
@@ -4353,10 +5527,7 @@
         </w:r>
       </w:hyperlink>
       <w:r>
-        <w:t xml:space="preserve"> </w:t>
-      </w:r>
-      <w:r>
-        <w:t>accesat la data de 21/05/2026</w:t>
+        <w:t xml:space="preserve"> accesat la data de 21/05/2026</w:t>
       </w:r>
     </w:p>
     <w:p>
@@ -4368,7 +5539,7 @@
         </w:numPr>
         <w:ind w:left="900" w:hanging="540"/>
       </w:pPr>
-      <w:hyperlink r:id="rId16" w:history="1">
+      <w:hyperlink r:id="rId18" w:history="1">
         <w:r>
           <w:rPr>
             <w:rStyle w:val="Hyperlink"/>
@@ -4377,10 +5548,7 @@
         </w:r>
       </w:hyperlink>
       <w:r>
-        <w:t xml:space="preserve"> </w:t>
-      </w:r>
-      <w:r>
-        <w:t>accesat la data de 21/05/2026</w:t>
+        <w:t xml:space="preserve"> accesat la data de 21/05/2026</w:t>
       </w:r>
     </w:p>
     <w:p>
@@ -4392,6 +5560,119 @@
         </w:numPr>
         <w:ind w:left="900" w:hanging="540"/>
       </w:pPr>
+      <w:r>
+        <w:t>Noble JA, Boukerroui D. Ultrasound image segmentation: a survey. IEEE Trans Med Imaging. 2006 Aug;25(8):987-1010. doi: 10.1109/tmi.2006.877092. PMID: 16894993.</w:t>
+      </w:r>
+    </w:p>
+    <w:p>
+      <w:pPr>
+        <w:pStyle w:val="caption-bibliography"/>
+        <w:numPr>
+          <w:ilvl w:val="0"/>
+          <w:numId w:val="5"/>
+        </w:numPr>
+        <w:ind w:left="900" w:hanging="540"/>
+      </w:pPr>
+      <w:r>
+        <w:t>Litjens G, Kooi T, Bejnordi BE, Setio AAA, Ciompi F, Ghafoorian M, van der Laak JAWM, van Ginneken B, Sánchez CI. A survey on deep learning in medical image analysis. Med Image Anal. 2017 Dec;42:60-88. doi: 10.1016/j.media.2017.07.005. Epub 2017 Jul 26. PMID: 28778026.</w:t>
+      </w:r>
+    </w:p>
+    <w:p>
+      <w:pPr>
+        <w:pStyle w:val="caption-bibliography"/>
+        <w:numPr>
+          <w:ilvl w:val="0"/>
+          <w:numId w:val="5"/>
+        </w:numPr>
+        <w:ind w:left="900" w:hanging="540"/>
+      </w:pPr>
+      <w:hyperlink r:id="rId19" w:history="1">
+        <w:r>
+          <w:rPr>
+            <w:rStyle w:val="Hyperlink"/>
+          </w:rPr>
+          <w:t>https://readmymri.com/blog/how-many-medical-imaging-scans-are-done-per-year</w:t>
+        </w:r>
+      </w:hyperlink>
+      <w:r>
+        <w:t xml:space="preserve"> accesat la 25/05/2026</w:t>
+      </w:r>
+    </w:p>
+    <w:p>
+      <w:pPr>
+        <w:pStyle w:val="caption-bibliography"/>
+        <w:numPr>
+          <w:ilvl w:val="0"/>
+          <w:numId w:val="5"/>
+        </w:numPr>
+        <w:ind w:left="900" w:hanging="540"/>
+      </w:pPr>
+      <w:r>
+        <w:t>O. Ronneberger, P. Fischer, and T. Brox, "U-Net: Convolutional Networks for Biomedical Image Segmentation," arXiv preprint arXiv:1505.04597, 2015.</w:t>
+      </w:r>
+    </w:p>
+    <w:p>
+      <w:pPr>
+        <w:pStyle w:val="caption-bibliography"/>
+        <w:numPr>
+          <w:ilvl w:val="0"/>
+          <w:numId w:val="5"/>
+        </w:numPr>
+        <w:ind w:left="900" w:hanging="540"/>
+      </w:pPr>
+      <w:r>
+        <w:t>K. He, X. Zhang, R. Shaoqing, and J. Sun, "Deep Residual Learning for Image Recognition," arXiv preprint arXiv:1512.03385, 2015.</w:t>
+      </w:r>
+    </w:p>
+    <w:p>
+      <w:pPr>
+        <w:pStyle w:val="caption-bibliography"/>
+        <w:numPr>
+          <w:ilvl w:val="0"/>
+          <w:numId w:val="5"/>
+        </w:numPr>
+        <w:ind w:left="900" w:hanging="540"/>
+      </w:pPr>
+      <w:r>
+        <w:t>Baumgartner CF, Kamnitsas K, Matthew J, Fletcher TP, Smith S, Koch LM, Kainz B, Rueckert D. SonoNet: Real-Time Detection and Localisation of Fetal Standard Scan Planes in Freehand Ultrasound. IEEE Trans Med Imaging. 2017 Nov;36(11):2204-2215. doi: 10.1109/TMI.2017.2712367. Epub 2017 Jul 11. PMID: 28708546; PMCID: PMC6051487.</w:t>
+      </w:r>
+    </w:p>
+    <w:p>
+      <w:pPr>
+        <w:pStyle w:val="caption-bibliography"/>
+        <w:numPr>
+          <w:ilvl w:val="0"/>
+          <w:numId w:val="5"/>
+        </w:numPr>
+        <w:ind w:left="900" w:hanging="540"/>
+      </w:pPr>
+      <w:r>
+        <w:t>Burgos-Artizzu XP, Coronado-Gutiérrez D, Valenzuela-Alcaraz B, Bonet-Carne E, Eixarch E, Crispi F, Gratacós E. Evaluation of deep convolutional neural networks for automatic classification of common maternal fetal ultrasound planes. Sci Rep. 2020 Jun 23;10(1):10200. doi: 10.1038/s41598-020-67076-5. Erratum in: Sci Rep. 2022 Jan 31;12(1):1950. doi: 10.1038/s41598-022-06173-z. PMID: 32576905; PMCID: PMC7311420.</w:t>
+      </w:r>
+    </w:p>
+    <w:p>
+      <w:pPr>
+        <w:pStyle w:val="caption-bibliography"/>
+        <w:numPr>
+          <w:ilvl w:val="0"/>
+          <w:numId w:val="5"/>
+        </w:numPr>
+        <w:ind w:left="900" w:hanging="540"/>
+      </w:pPr>
+      <w:r>
+        <w:lastRenderedPageBreak/>
+        <w:t>Liu, L., Tang, D., Li, X. et al. Automatic fetal ultrasound image segmentation of first trimester for measuring biometric parameters based on deep learning. Multimed Tools Appl </w:t>
+      </w:r>
+      <w:r>
+        <w:rPr>
+          <w:b/>
+          <w:bCs/>
+        </w:rPr>
+        <w:t>83</w:t>
+      </w:r>
+      <w:r>
+        <w:t>, 27283–27304 (2024). https://doi.org/10.1007/s11042-023-16565-6</w:t>
+      </w:r>
     </w:p>
     <w:p/>
     <w:p/>
@@ -4659,7 +5940,6 @@
         <w:rPr>
           <w:szCs w:val="20"/>
         </w:rPr>
-        <w:lastRenderedPageBreak/>
         <w:t xml:space="preserve">[4] </w:t>
       </w:r>
       <w:r>
@@ -4709,12 +5989,12 @@
         </w:numPr>
         <w:ind w:left="540"/>
       </w:pPr>
-      <w:bookmarkStart w:id="15" w:name="_Toc206594669"/>
+      <w:bookmarkStart w:id="13" w:name="_Toc206594669"/>
       <w:r>
         <w:lastRenderedPageBreak/>
         <w:t>Annex 1</w:t>
       </w:r>
-      <w:bookmarkEnd w:id="15"/>
+      <w:bookmarkEnd w:id="13"/>
     </w:p>
     <w:p/>
     <w:p>
@@ -4780,12 +6060,12 @@
         </w:numPr>
         <w:ind w:left="540"/>
       </w:pPr>
-      <w:bookmarkStart w:id="16" w:name="_Toc206594670"/>
+      <w:bookmarkStart w:id="14" w:name="_Toc206594670"/>
       <w:r>
         <w:lastRenderedPageBreak/>
         <w:t>Annex 2</w:t>
       </w:r>
-      <w:bookmarkEnd w:id="16"/>
+      <w:bookmarkEnd w:id="14"/>
     </w:p>
     <w:p/>
     <w:p>
@@ -4829,7 +6109,7 @@
         </w:numPr>
         <w:ind w:left="540" w:hanging="540"/>
       </w:pPr>
-      <w:bookmarkStart w:id="17" w:name="_Toc206594671"/>
+      <w:bookmarkStart w:id="15" w:name="_Toc206594671"/>
       <w:r>
         <w:lastRenderedPageBreak/>
         <w:t>I</w:t>
@@ -4837,7 +6117,7 @@
       <w:r>
         <w:t>MPORTANT stuff to read XXXX</w:t>
       </w:r>
-      <w:bookmarkEnd w:id="17"/>
+      <w:bookmarkEnd w:id="15"/>
     </w:p>
     <w:p/>
     <w:p>
@@ -4866,7 +6146,7 @@
       <w:r>
         <w:t xml:space="preserve">email a "thank you" at </w:t>
       </w:r>
-      <w:hyperlink r:id="rId17" w:history="1">
+      <w:hyperlink r:id="rId20" w:history="1">
         <w:r>
           <w:rPr>
             <w:rStyle w:val="Hyperlink"/>
@@ -4883,7 +6163,7 @@
       <w:r>
         <w:t xml:space="preserve"> </w:t>
       </w:r>
-      <w:hyperlink r:id="rId18" w:history="1">
+      <w:hyperlink r:id="rId21" w:history="1">
         <w:r>
           <w:rPr>
             <w:rStyle w:val="Hyperlink"/>
@@ -5767,7 +7047,7 @@
               <w:pStyle w:val="caption-image-ro"/>
               <w:keepNext/>
             </w:pPr>
-            <w:bookmarkStart w:id="18" w:name="_Toc206594672"/>
+            <w:bookmarkStart w:id="16" w:name="_Toc206594672"/>
             <w:r>
               <w:t xml:space="preserve">Figura </w:t>
             </w:r>
@@ -5813,7 +7093,7 @@
             <w:r>
               <w:t xml:space="preserve"> - XXXX schimba titlul</w:t>
             </w:r>
-            <w:bookmarkEnd w:id="18"/>
+            <w:bookmarkEnd w:id="16"/>
           </w:p>
         </w:tc>
       </w:tr>
@@ -5871,7 +7151,7 @@
               <w:pStyle w:val="caption-image-eng"/>
               <w:keepNext/>
             </w:pPr>
-            <w:bookmarkStart w:id="19" w:name="_Toc206594673"/>
+            <w:bookmarkStart w:id="17" w:name="_Toc206594673"/>
             <w:r>
               <w:t xml:space="preserve">Figure </w:t>
             </w:r>
@@ -5917,7 +7197,7 @@
             <w:r>
               <w:t xml:space="preserve"> XXXX change title</w:t>
             </w:r>
-            <w:bookmarkEnd w:id="19"/>
+            <w:bookmarkEnd w:id="17"/>
           </w:p>
         </w:tc>
       </w:tr>
@@ -5978,7 +7258,7 @@
               <w:pStyle w:val="caption-table-ro"/>
               <w:keepNext/>
             </w:pPr>
-            <w:bookmarkStart w:id="20" w:name="_Toc206594674"/>
+            <w:bookmarkStart w:id="18" w:name="_Toc206594674"/>
             <w:r>
               <w:t xml:space="preserve">Tabelul </w:t>
             </w:r>
@@ -6024,7 +7304,7 @@
             <w:r>
               <w:t xml:space="preserve"> XXXX schimba titlul</w:t>
             </w:r>
-            <w:bookmarkEnd w:id="20"/>
+            <w:bookmarkEnd w:id="18"/>
           </w:p>
         </w:tc>
       </w:tr>
@@ -6079,7 +7359,7 @@
               <w:pStyle w:val="caption-table-eng"/>
               <w:keepNext/>
             </w:pPr>
-            <w:bookmarkStart w:id="21" w:name="_Toc206594675"/>
+            <w:bookmarkStart w:id="19" w:name="_Toc206594675"/>
             <w:r>
               <w:t xml:space="preserve">Table </w:t>
             </w:r>
@@ -6128,7 +7408,7 @@
             <w:r>
               <w:t xml:space="preserve"> XXXX change title</w:t>
             </w:r>
-            <w:bookmarkEnd w:id="21"/>
+            <w:bookmarkEnd w:id="19"/>
           </w:p>
         </w:tc>
       </w:tr>
@@ -6189,8 +7469,8 @@
               <w:pStyle w:val="caption-equation-ro"/>
               <w:keepNext/>
             </w:pPr>
-            <w:bookmarkStart w:id="22" w:name="_Toc12794105"/>
-            <w:bookmarkStart w:id="23" w:name="_Toc206594676"/>
+            <w:bookmarkStart w:id="20" w:name="_Toc12794105"/>
+            <w:bookmarkStart w:id="21" w:name="_Toc206594676"/>
             <w:r>
               <w:t xml:space="preserve">Ecuaţia </w:t>
             </w:r>
@@ -6239,8 +7519,8 @@
             <w:r>
               <w:t xml:space="preserve"> XXXX schimba titlul</w:t>
             </w:r>
-            <w:bookmarkEnd w:id="22"/>
-            <w:bookmarkEnd w:id="23"/>
+            <w:bookmarkEnd w:id="20"/>
+            <w:bookmarkEnd w:id="21"/>
           </w:p>
         </w:tc>
       </w:tr>
@@ -6298,8 +7578,8 @@
               <w:pStyle w:val="caption-equation-eng"/>
               <w:keepNext/>
             </w:pPr>
-            <w:bookmarkStart w:id="24" w:name="_Toc12794106"/>
-            <w:bookmarkStart w:id="25" w:name="_Toc206594677"/>
+            <w:bookmarkStart w:id="22" w:name="_Toc12794106"/>
+            <w:bookmarkStart w:id="23" w:name="_Toc206594677"/>
             <w:r>
               <w:t xml:space="preserve">Equation </w:t>
             </w:r>
@@ -6345,8 +7625,8 @@
             <w:r>
               <w:t xml:space="preserve"> XXXX change title</w:t>
             </w:r>
-            <w:bookmarkEnd w:id="24"/>
-            <w:bookmarkEnd w:id="25"/>
+            <w:bookmarkEnd w:id="22"/>
+            <w:bookmarkEnd w:id="23"/>
           </w:p>
         </w:tc>
       </w:tr>
@@ -6392,22 +7672,6 @@
     </w:p>
   </w:endnote>
 </w:endnotes>
-</file>
-
-<file path=word/footer1.xml><?xml version="1.0" encoding="utf-8"?>
-<w:ftr xmlns:wpc="http://schemas.microsoft.com/office/word/2010/wordprocessingCanvas" xmlns:cx="http://schemas.microsoft.com/office/drawing/2014/chartex" xmlns:cx1="http://schemas.microsoft.com/office/drawing/2015/9/8/chartex" xmlns:cx2="http://schemas.microsoft.com/office/drawing/2015/10/21/chartex" xmlns:cx3="http://schemas.microsoft.com/office/drawing/2016/5/9/chartex" xmlns:cx4="http://schemas.microsoft.com/office/drawing/2016/5/10/chartex" xmlns:cx5="http://schemas.microsoft.com/office/drawing/2016/5/11/chartex" xmlns:cx6="http://schemas.microsoft.com/office/drawing/2016/5/12/chartex" xmlns:cx7="http://schemas.microsoft.com/office/drawing/2016/5/13/chartex" xmlns:cx8="http://schemas.microsoft.com/office/drawing/2016/5/14/chartex" xmlns:mc="http://schemas.openxmlformats.org/markup-compatibility/2006" xmlns:aink="http://schemas.microsoft.com/office/drawing/2016/ink" xmlns:am3d="http://schemas.microsoft.com/office/drawing/2017/model3d" xmlns:o="urn:schemas-microsoft-com:office:office" xmlns:oel="http://schemas.microsoft.com/office/2019/extlst" xmlns:r="http://schemas.openxmlformats.org/officeDocument/2006/relationships" xmlns:m="http://schemas.openxmlformats.org/officeDocument/2006/math" xmlns:v="urn:schemas-microsoft-com:vml" xmlns:wp14="http://schemas.microsoft.com/office/word/2010/wordprocessingDrawing" xmlns:wp="http://schemas.openxmlformats.org/drawingml/2006/wordprocessingDrawing" xmlns:w10="urn:schemas-microsoft-com:office:word" xmlns:w="http://schemas.openxmlformats.org/wordprocessingml/2006/main" xmlns:w14="http://schemas.microsoft.com/office/word/2010/wordml" xmlns:w15="http://schemas.microsoft.com/office/word/2012/wordml" xmlns:w16cex="http://schemas.microsoft.com/office/word/2018/wordml/cex" xmlns:w16cid="http://schemas.microsoft.com/office/word/2016/wordml/cid" xmlns:w16="http://schemas.microsoft.com/office/word/2018/wordml" xmlns:w16du="http://schemas.microsoft.com/office/word/2023/wordml/word16du" xmlns:w16sdtdh="http://schemas.microsoft.com/office/word/2020/wordml/sdtdatahash" xmlns:w16sdtfl="http://schemas.microsoft.com/office/word/2024/wordml/sdtformatlock" xmlns:w16se="http://schemas.microsoft.com/office/word/2015/wordml/symex" xmlns:wpg="http://schemas.microsoft.com/office/word/2010/wordprocessingGroup" xmlns:wpi="http://schemas.microsoft.com/office/word/2010/wordprocessingInk" xmlns:wne="http://schemas.microsoft.com/office/word/2006/wordml" xmlns:wps="http://schemas.microsoft.com/office/word/2010/wordprocessingShape" mc:Ignorable="w14 w15 w16se w16cid w16 w16cex w16sdtdh w16sdtfl w16du wp14">
-  <w:p>
-    <w:pPr>
-      <w:pStyle w:val="Footer"/>
-    </w:pPr>
-    <w:r>
-      <w:t>XXXX deselecteaza different first page si dai cu page number sa inceapa de la cat o fi ajuns, ce pag e asta (vezi ca si alea albe care nu se vad se numara). page number -&gt; format page number si dai de acolo de la cat sa inceapa. asta faci la sfarsit de tot. last thing</w:t>
-    </w:r>
-    <w:r>
-      <w:t xml:space="preserve"> inainte de export pdf</w:t>
-    </w:r>
-  </w:p>
-</w:ftr>
 </file>
 
 <file path=word/footnotes.xml><?xml version="1.0" encoding="utf-8"?>
@@ -6528,107 +7792,13 @@
     </w:lvl>
   </w:abstractNum>
   <w:abstractNum w:abstractNumId="1" w15:restartNumberingAfterBreak="0">
-    <w:nsid w:val="140669F9"/>
-    <w:multiLevelType w:val="multilevel"/>
-    <w:tmpl w:val="B142CD4E"/>
-    <w:lvl w:ilvl="0">
+    <w:nsid w:val="05FE0109"/>
+    <w:multiLevelType w:val="hybridMultilevel"/>
+    <w:tmpl w:val="1210619C"/>
+    <w:lvl w:ilvl="0" w:tplc="0409000F">
       <w:start w:val="1"/>
       <w:numFmt w:val="decimal"/>
-      <w:lvlText w:val="%1"/>
-      <w:lvlJc w:val="left"/>
-      <w:pPr>
-        <w:ind w:left="432" w:hanging="432"/>
-      </w:pPr>
-    </w:lvl>
-    <w:lvl w:ilvl="1">
-      <w:start w:val="1"/>
-      <w:numFmt w:val="decimal"/>
-      <w:pStyle w:val="Heading2"/>
-      <w:lvlText w:val="%1.%2"/>
-      <w:lvlJc w:val="left"/>
-      <w:pPr>
-        <w:ind w:left="576" w:hanging="576"/>
-      </w:pPr>
-    </w:lvl>
-    <w:lvl w:ilvl="2">
-      <w:start w:val="1"/>
-      <w:numFmt w:val="decimal"/>
-      <w:pStyle w:val="Heading3"/>
-      <w:lvlText w:val="%1.%2.%3"/>
-      <w:lvlJc w:val="left"/>
-      <w:pPr>
-        <w:ind w:left="720" w:hanging="720"/>
-      </w:pPr>
-    </w:lvl>
-    <w:lvl w:ilvl="3">
-      <w:start w:val="1"/>
-      <w:numFmt w:val="decimal"/>
-      <w:pStyle w:val="Heading4"/>
-      <w:lvlText w:val="%1.%2.%3.%4"/>
-      <w:lvlJc w:val="left"/>
-      <w:pPr>
-        <w:ind w:left="864" w:hanging="864"/>
-      </w:pPr>
-    </w:lvl>
-    <w:lvl w:ilvl="4">
-      <w:start w:val="1"/>
-      <w:numFmt w:val="decimal"/>
-      <w:pStyle w:val="Heading5"/>
-      <w:lvlText w:val="%1.%2.%3.%4.%5"/>
-      <w:lvlJc w:val="left"/>
-      <w:pPr>
-        <w:ind w:left="1008" w:hanging="1008"/>
-      </w:pPr>
-    </w:lvl>
-    <w:lvl w:ilvl="5">
-      <w:start w:val="1"/>
-      <w:numFmt w:val="decimal"/>
-      <w:pStyle w:val="Heading6"/>
-      <w:lvlText w:val="%1.%2.%3.%4.%5.%6"/>
-      <w:lvlJc w:val="left"/>
-      <w:pPr>
-        <w:ind w:left="1152" w:hanging="1152"/>
-      </w:pPr>
-    </w:lvl>
-    <w:lvl w:ilvl="6">
-      <w:start w:val="1"/>
-      <w:numFmt w:val="decimal"/>
-      <w:pStyle w:val="Heading7"/>
-      <w:lvlText w:val="%1.%2.%3.%4.%5.%6.%7"/>
-      <w:lvlJc w:val="left"/>
-      <w:pPr>
-        <w:ind w:left="1296" w:hanging="1296"/>
-      </w:pPr>
-    </w:lvl>
-    <w:lvl w:ilvl="7">
-      <w:start w:val="1"/>
-      <w:numFmt w:val="decimal"/>
-      <w:pStyle w:val="Heading8"/>
-      <w:lvlText w:val="%1.%2.%3.%4.%5.%6.%7.%8"/>
-      <w:lvlJc w:val="left"/>
-      <w:pPr>
-        <w:ind w:left="1440" w:hanging="1440"/>
-      </w:pPr>
-    </w:lvl>
-    <w:lvl w:ilvl="8">
-      <w:start w:val="1"/>
-      <w:numFmt w:val="decimal"/>
-      <w:pStyle w:val="Heading9"/>
-      <w:lvlText w:val="%1.%2.%3.%4.%5.%6.%7.%8.%9"/>
-      <w:lvlJc w:val="left"/>
-      <w:pPr>
-        <w:ind w:left="1584" w:hanging="1584"/>
-      </w:pPr>
-    </w:lvl>
-  </w:abstractNum>
-  <w:abstractNum w:abstractNumId="2" w15:restartNumberingAfterBreak="0">
-    <w:nsid w:val="365F0D07"/>
-    <w:multiLevelType w:val="hybridMultilevel"/>
-    <w:tmpl w:val="1DC6AC64"/>
-    <w:lvl w:ilvl="0" w:tplc="04090011">
-      <w:start w:val="1"/>
-      <w:numFmt w:val="decimal"/>
-      <w:lvlText w:val="%1)"/>
+      <w:lvlText w:val="%1."/>
       <w:lvlJc w:val="left"/>
       <w:pPr>
         <w:ind w:left="720" w:hanging="360"/>
@@ -6710,14 +7880,108 @@
       </w:pPr>
     </w:lvl>
   </w:abstractNum>
-  <w:abstractNum w:abstractNumId="3" w15:restartNumberingAfterBreak="0">
-    <w:nsid w:val="382B0427"/>
-    <w:multiLevelType w:val="hybridMultilevel"/>
-    <w:tmpl w:val="ED6E20F0"/>
-    <w:lvl w:ilvl="0" w:tplc="01D6AAAC">
+  <w:abstractNum w:abstractNumId="2" w15:restartNumberingAfterBreak="0">
+    <w:nsid w:val="140669F9"/>
+    <w:multiLevelType w:val="multilevel"/>
+    <w:tmpl w:val="B142CD4E"/>
+    <w:lvl w:ilvl="0">
       <w:start w:val="1"/>
       <w:numFmt w:val="decimal"/>
-      <w:lvlText w:val="[%1]"/>
+      <w:lvlText w:val="%1"/>
+      <w:lvlJc w:val="left"/>
+      <w:pPr>
+        <w:ind w:left="432" w:hanging="432"/>
+      </w:pPr>
+    </w:lvl>
+    <w:lvl w:ilvl="1">
+      <w:start w:val="1"/>
+      <w:numFmt w:val="decimal"/>
+      <w:pStyle w:val="Heading2"/>
+      <w:lvlText w:val="%1.%2"/>
+      <w:lvlJc w:val="left"/>
+      <w:pPr>
+        <w:ind w:left="576" w:hanging="576"/>
+      </w:pPr>
+    </w:lvl>
+    <w:lvl w:ilvl="2">
+      <w:start w:val="1"/>
+      <w:numFmt w:val="decimal"/>
+      <w:pStyle w:val="Heading3"/>
+      <w:lvlText w:val="%1.%2.%3"/>
+      <w:lvlJc w:val="left"/>
+      <w:pPr>
+        <w:ind w:left="720" w:hanging="720"/>
+      </w:pPr>
+    </w:lvl>
+    <w:lvl w:ilvl="3">
+      <w:start w:val="1"/>
+      <w:numFmt w:val="decimal"/>
+      <w:pStyle w:val="Heading4"/>
+      <w:lvlText w:val="%1.%2.%3.%4"/>
+      <w:lvlJc w:val="left"/>
+      <w:pPr>
+        <w:ind w:left="864" w:hanging="864"/>
+      </w:pPr>
+    </w:lvl>
+    <w:lvl w:ilvl="4">
+      <w:start w:val="1"/>
+      <w:numFmt w:val="decimal"/>
+      <w:pStyle w:val="Heading5"/>
+      <w:lvlText w:val="%1.%2.%3.%4.%5"/>
+      <w:lvlJc w:val="left"/>
+      <w:pPr>
+        <w:ind w:left="1008" w:hanging="1008"/>
+      </w:pPr>
+    </w:lvl>
+    <w:lvl w:ilvl="5">
+      <w:start w:val="1"/>
+      <w:numFmt w:val="decimal"/>
+      <w:pStyle w:val="Heading6"/>
+      <w:lvlText w:val="%1.%2.%3.%4.%5.%6"/>
+      <w:lvlJc w:val="left"/>
+      <w:pPr>
+        <w:ind w:left="1152" w:hanging="1152"/>
+      </w:pPr>
+    </w:lvl>
+    <w:lvl w:ilvl="6">
+      <w:start w:val="1"/>
+      <w:numFmt w:val="decimal"/>
+      <w:pStyle w:val="Heading7"/>
+      <w:lvlText w:val="%1.%2.%3.%4.%5.%6.%7"/>
+      <w:lvlJc w:val="left"/>
+      <w:pPr>
+        <w:ind w:left="1296" w:hanging="1296"/>
+      </w:pPr>
+    </w:lvl>
+    <w:lvl w:ilvl="7">
+      <w:start w:val="1"/>
+      <w:numFmt w:val="decimal"/>
+      <w:pStyle w:val="Heading8"/>
+      <w:lvlText w:val="%1.%2.%3.%4.%5.%6.%7.%8"/>
+      <w:lvlJc w:val="left"/>
+      <w:pPr>
+        <w:ind w:left="1440" w:hanging="1440"/>
+      </w:pPr>
+    </w:lvl>
+    <w:lvl w:ilvl="8">
+      <w:start w:val="1"/>
+      <w:numFmt w:val="decimal"/>
+      <w:pStyle w:val="Heading9"/>
+      <w:lvlText w:val="%1.%2.%3.%4.%5.%6.%7.%8.%9"/>
+      <w:lvlJc w:val="left"/>
+      <w:pPr>
+        <w:ind w:left="1584" w:hanging="1584"/>
+      </w:pPr>
+    </w:lvl>
+  </w:abstractNum>
+  <w:abstractNum w:abstractNumId="3" w15:restartNumberingAfterBreak="0">
+    <w:nsid w:val="365F0D07"/>
+    <w:multiLevelType w:val="hybridMultilevel"/>
+    <w:tmpl w:val="1DC6AC64"/>
+    <w:lvl w:ilvl="0" w:tplc="04090011">
+      <w:start w:val="1"/>
+      <w:numFmt w:val="decimal"/>
+      <w:lvlText w:val="%1)"/>
       <w:lvlJc w:val="left"/>
       <w:pPr>
         <w:ind w:left="720" w:hanging="360"/>
@@ -6800,6 +8064,95 @@
     </w:lvl>
   </w:abstractNum>
   <w:abstractNum w:abstractNumId="4" w15:restartNumberingAfterBreak="0">
+    <w:nsid w:val="382B0427"/>
+    <w:multiLevelType w:val="hybridMultilevel"/>
+    <w:tmpl w:val="ED6E20F0"/>
+    <w:lvl w:ilvl="0" w:tplc="01D6AAAC">
+      <w:start w:val="1"/>
+      <w:numFmt w:val="decimal"/>
+      <w:lvlText w:val="[%1]"/>
+      <w:lvlJc w:val="left"/>
+      <w:pPr>
+        <w:ind w:left="720" w:hanging="360"/>
+      </w:pPr>
+      <w:rPr>
+        <w:rFonts w:hint="default"/>
+      </w:rPr>
+    </w:lvl>
+    <w:lvl w:ilvl="1" w:tplc="04090019" w:tentative="1">
+      <w:start w:val="1"/>
+      <w:numFmt w:val="lowerLetter"/>
+      <w:lvlText w:val="%2."/>
+      <w:lvlJc w:val="left"/>
+      <w:pPr>
+        <w:ind w:left="1440" w:hanging="360"/>
+      </w:pPr>
+    </w:lvl>
+    <w:lvl w:ilvl="2" w:tplc="0409001B" w:tentative="1">
+      <w:start w:val="1"/>
+      <w:numFmt w:val="lowerRoman"/>
+      <w:lvlText w:val="%3."/>
+      <w:lvlJc w:val="right"/>
+      <w:pPr>
+        <w:ind w:left="2160" w:hanging="180"/>
+      </w:pPr>
+    </w:lvl>
+    <w:lvl w:ilvl="3" w:tplc="0409000F" w:tentative="1">
+      <w:start w:val="1"/>
+      <w:numFmt w:val="decimal"/>
+      <w:lvlText w:val="%4."/>
+      <w:lvlJc w:val="left"/>
+      <w:pPr>
+        <w:ind w:left="2880" w:hanging="360"/>
+      </w:pPr>
+    </w:lvl>
+    <w:lvl w:ilvl="4" w:tplc="04090019" w:tentative="1">
+      <w:start w:val="1"/>
+      <w:numFmt w:val="lowerLetter"/>
+      <w:lvlText w:val="%5."/>
+      <w:lvlJc w:val="left"/>
+      <w:pPr>
+        <w:ind w:left="3600" w:hanging="360"/>
+      </w:pPr>
+    </w:lvl>
+    <w:lvl w:ilvl="5" w:tplc="0409001B" w:tentative="1">
+      <w:start w:val="1"/>
+      <w:numFmt w:val="lowerRoman"/>
+      <w:lvlText w:val="%6."/>
+      <w:lvlJc w:val="right"/>
+      <w:pPr>
+        <w:ind w:left="4320" w:hanging="180"/>
+      </w:pPr>
+    </w:lvl>
+    <w:lvl w:ilvl="6" w:tplc="0409000F" w:tentative="1">
+      <w:start w:val="1"/>
+      <w:numFmt w:val="decimal"/>
+      <w:lvlText w:val="%7."/>
+      <w:lvlJc w:val="left"/>
+      <w:pPr>
+        <w:ind w:left="5040" w:hanging="360"/>
+      </w:pPr>
+    </w:lvl>
+    <w:lvl w:ilvl="7" w:tplc="04090019" w:tentative="1">
+      <w:start w:val="1"/>
+      <w:numFmt w:val="lowerLetter"/>
+      <w:lvlText w:val="%8."/>
+      <w:lvlJc w:val="left"/>
+      <w:pPr>
+        <w:ind w:left="5760" w:hanging="360"/>
+      </w:pPr>
+    </w:lvl>
+    <w:lvl w:ilvl="8" w:tplc="0409001B" w:tentative="1">
+      <w:start w:val="1"/>
+      <w:numFmt w:val="lowerRoman"/>
+      <w:lvlText w:val="%9."/>
+      <w:lvlJc w:val="right"/>
+      <w:pPr>
+        <w:ind w:left="6480" w:hanging="180"/>
+      </w:pPr>
+    </w:lvl>
+  </w:abstractNum>
+  <w:abstractNum w:abstractNumId="5" w15:restartNumberingAfterBreak="0">
     <w:nsid w:val="43CB07BE"/>
     <w:multiLevelType w:val="multilevel"/>
     <w:tmpl w:val="8056FC22"/>
@@ -6885,7 +8238,7 @@
       </w:pPr>
     </w:lvl>
   </w:abstractNum>
-  <w:abstractNum w:abstractNumId="5" w15:restartNumberingAfterBreak="0">
+  <w:abstractNum w:abstractNumId="6" w15:restartNumberingAfterBreak="0">
     <w:nsid w:val="581A1B45"/>
     <w:multiLevelType w:val="hybridMultilevel"/>
     <w:tmpl w:val="81EE1C22"/>
@@ -6975,7 +8328,7 @@
       </w:pPr>
     </w:lvl>
   </w:abstractNum>
-  <w:abstractNum w:abstractNumId="6" w15:restartNumberingAfterBreak="0">
+  <w:abstractNum w:abstractNumId="7" w15:restartNumberingAfterBreak="0">
     <w:nsid w:val="5FA76738"/>
     <w:multiLevelType w:val="hybridMultilevel"/>
     <w:tmpl w:val="A942BB1A"/>
@@ -7088,7 +8441,7 @@
       </w:pPr>
     </w:lvl>
   </w:abstractNum>
-  <w:abstractNum w:abstractNumId="7" w15:restartNumberingAfterBreak="0">
+  <w:abstractNum w:abstractNumId="8" w15:restartNumberingAfterBreak="0">
     <w:nsid w:val="69FC44EC"/>
     <w:multiLevelType w:val="hybridMultilevel"/>
     <w:tmpl w:val="B114D4CC"/>
@@ -7202,28 +8555,31 @@
     </w:lvl>
   </w:abstractNum>
   <w:num w:numId="1" w16cid:durableId="1542353828">
+    <w:abstractNumId w:val="3"/>
+  </w:num>
+  <w:num w:numId="2" w16cid:durableId="2004582032">
+    <w:abstractNumId w:val="6"/>
+  </w:num>
+  <w:num w:numId="3" w16cid:durableId="1987011362">
     <w:abstractNumId w:val="2"/>
   </w:num>
-  <w:num w:numId="2" w16cid:durableId="2004582032">
+  <w:num w:numId="4" w16cid:durableId="751901715">
     <w:abstractNumId w:val="5"/>
   </w:num>
-  <w:num w:numId="3" w16cid:durableId="1987011362">
-    <w:abstractNumId w:val="1"/>
-  </w:num>
-  <w:num w:numId="4" w16cid:durableId="751901715">
+  <w:num w:numId="5" w16cid:durableId="1755980034">
     <w:abstractNumId w:val="4"/>
-  </w:num>
-  <w:num w:numId="5" w16cid:durableId="1755980034">
-    <w:abstractNumId w:val="3"/>
   </w:num>
   <w:num w:numId="6" w16cid:durableId="1012802755">
     <w:abstractNumId w:val="0"/>
   </w:num>
   <w:num w:numId="7" w16cid:durableId="1431700940">
-    <w:abstractNumId w:val="6"/>
+    <w:abstractNumId w:val="7"/>
   </w:num>
   <w:num w:numId="8" w16cid:durableId="1034814653">
-    <w:abstractNumId w:val="7"/>
+    <w:abstractNumId w:val="8"/>
+  </w:num>
+  <w:num w:numId="9" w16cid:durableId="789520445">
+    <w:abstractNumId w:val="1"/>
   </w:num>
   <w:numIdMacAtCleanup w:val="8"/>
 </w:numbering>
@@ -7856,7 +9212,6 @@
   <w:style w:type="character" w:default="1" w:styleId="DefaultParagraphFont">
     <w:name w:val="Default Paragraph Font"/>
     <w:uiPriority w:val="1"/>
-    <w:semiHidden/>
     <w:unhideWhenUsed/>
   </w:style>
   <w:style w:type="table" w:default="1" w:styleId="TableNormal">

</xml_diff>